<commit_message>
Add new Excel files for project documentation and data dictionary
- Created 'Diagram~$Data_Dictionary_SProject edit alredyBlue.xlsx' for data dictionary updates.
- Added 'เวิร์กบุ๊ก1.xlsx' containing project-related information and resources.
</commit_message>
<xml_diff>
--- a/script presentation/Online Presentation Script.docx
+++ b/script presentation/Online Presentation Script.docx
@@ -5,688 +5,2089 @@
     <w:p>
       <w:pPr>
         <w:rPr>
-          <w:b/>
-          <w:bCs/>
-        </w:rPr>
-      </w:pPr>
-      <w:r>
-        <w:rPr>
-          <w:b/>
-          <w:bCs/>
-        </w:rPr>
-        <w:t>Online Presentation Script: Simplified &amp; Student-Friendly</w:t>
+          <w:rFonts w:ascii="Segoe UI Emoji" w:hAnsi="Segoe UI Emoji" w:cs="Segoe UI Emoji"/>
+          <w:b/>
+          <w:bCs/>
+        </w:rPr>
+      </w:pPr>
+      <w:r>
+        <w:rPr>
+          <w:rFonts w:ascii="Segoe UI Emoji" w:hAnsi="Segoe UI Emoji" w:cs="Segoe UI Emoji"/>
+          <w:b/>
+          <w:bCs/>
+        </w:rPr>
+        <w:t>🎙️ English Presentation Script: Temporary Rental Space Management System of MFU</w:t>
       </w:r>
     </w:p>
     <w:p>
-      <w:r>
-        <w:rPr>
-          <w:b/>
-          <w:bCs/>
-        </w:rPr>
-        <w:t>[Slide 1: Title &amp; Introduction]</w:t>
+      <w:pPr>
+        <w:rPr>
+          <w:rFonts w:ascii="Segoe UI Emoji" w:hAnsi="Segoe UI Emoji" w:cs="Segoe UI Emoji"/>
+        </w:rPr>
+      </w:pPr>
+      <w:r>
+        <w:rPr>
+          <w:rFonts w:ascii="Segoe UI Emoji" w:hAnsi="Segoe UI Emoji" w:cs="Segoe UI Emoji"/>
+          <w:b/>
+          <w:bCs/>
+        </w:rPr>
+        <w:t>Estimated Total Time:</w:t>
+      </w:r>
+      <w:r>
+        <w:rPr>
+          <w:rFonts w:ascii="Segoe UI Emoji" w:hAnsi="Segoe UI Emoji" w:cs="Segoe UI Emoji"/>
+        </w:rPr>
+        <w:t xml:space="preserve"> 20 Minutes</w:t>
       </w:r>
     </w:p>
     <w:p>
-      <w:r>
-        <w:rPr>
-          <w:b/>
-          <w:bCs/>
-        </w:rPr>
-        <w:t xml:space="preserve">(Presenter 1: </w:t>
-      </w:r>
-      <w:proofErr w:type="spellStart"/>
-      <w:r>
-        <w:rPr>
-          <w:b/>
-          <w:bCs/>
-        </w:rPr>
-        <w:t>Paniti</w:t>
-      </w:r>
-      <w:proofErr w:type="spellEnd"/>
-      <w:r>
-        <w:rPr>
-          <w:b/>
-          <w:bCs/>
-        </w:rPr>
-        <w:t>)</w:t>
+      <w:pPr>
+        <w:rPr>
+          <w:rFonts w:ascii="Segoe UI Emoji" w:hAnsi="Segoe UI Emoji" w:cs="Segoe UI Emoji"/>
+        </w:rPr>
+      </w:pPr>
+      <w:r>
+        <w:rPr>
+          <w:rFonts w:ascii="Segoe UI Emoji" w:hAnsi="Segoe UI Emoji" w:cs="Segoe UI Emoji"/>
+        </w:rPr>
+        <w:pict w14:anchorId="6E7037E4">
+          <v:rect id="_x0000_i1060" style="width:0;height:1.5pt" o:hralign="center" o:hrstd="t" o:hr="t" fillcolor="#a0a0a0" stroked="f"/>
+        </w:pict>
       </w:r>
     </w:p>
     <w:p>
       <w:pPr>
+        <w:rPr>
+          <w:rFonts w:ascii="Segoe UI Emoji" w:hAnsi="Segoe UI Emoji" w:cs="Segoe UI Emoji"/>
+          <w:b/>
+          <w:bCs/>
+        </w:rPr>
+      </w:pPr>
+      <w:r>
+        <w:rPr>
+          <w:rFonts w:ascii="Segoe UI Emoji" w:hAnsi="Segoe UI Emoji" w:cs="Segoe UI Emoji"/>
+          <w:b/>
+          <w:bCs/>
+        </w:rPr>
+        <w:t>🟢 INTRODUCTION &amp; GREETING (~1 Minute)</w:t>
+      </w:r>
+    </w:p>
+    <w:p>
+      <w:pPr>
+        <w:rPr>
+          <w:rFonts w:ascii="Segoe UI Emoji" w:hAnsi="Segoe UI Emoji" w:cs="Segoe UI Emoji"/>
+        </w:rPr>
+      </w:pPr>
+      <w:r>
+        <w:rPr>
+          <w:rFonts w:ascii="Segoe UI Emoji" w:hAnsi="Segoe UI Emoji" w:cs="Segoe UI Emoji"/>
+          <w:b/>
+          <w:bCs/>
+        </w:rPr>
+        <w:t>☑ Slide 1: TITLE SLIDE</w:t>
+      </w:r>
+      <w:r>
+        <w:rPr>
+          <w:rFonts w:ascii="Segoe UI Emoji" w:hAnsi="Segoe UI Emoji" w:cs="Segoe UI Emoji"/>
+        </w:rPr>
+        <w:t xml:space="preserve"> </w:t>
+      </w:r>
+      <w:r>
+        <w:rPr>
+          <w:rFonts w:ascii="Segoe UI Emoji" w:hAnsi="Segoe UI Emoji" w:cs="Segoe UI Emoji"/>
+          <w:b/>
+          <w:bCs/>
+        </w:rPr>
+        <w:t>[</w:t>
+      </w:r>
+      <w:proofErr w:type="spellStart"/>
+      <w:r>
+        <w:rPr>
+          <w:rFonts w:ascii="Segoe UI Emoji" w:hAnsi="Segoe UI Emoji" w:cs="Segoe UI Emoji"/>
+          <w:b/>
+          <w:bCs/>
+        </w:rPr>
+        <w:t>Paniti</w:t>
+      </w:r>
+      <w:proofErr w:type="spellEnd"/>
+      <w:r>
+        <w:rPr>
+          <w:rFonts w:ascii="Segoe UI Emoji" w:hAnsi="Segoe UI Emoji" w:cs="Segoe UI Emoji"/>
+          <w:b/>
+          <w:bCs/>
+        </w:rPr>
+        <w:t>]</w:t>
+      </w:r>
+      <w:r>
+        <w:rPr>
+          <w:rFonts w:ascii="Segoe UI Emoji" w:hAnsi="Segoe UI Emoji" w:cs="Segoe UI Emoji"/>
+        </w:rPr>
+        <w:t xml:space="preserve"> "Good afternoon, respected committee members. Welcome to our Senior Projec</w:t>
+      </w:r>
+      <w:r>
+        <w:rPr>
+          <w:rFonts w:ascii="Segoe UI Emoji" w:hAnsi="Segoe UI Emoji" w:cs="Segoe UI Emoji"/>
+        </w:rPr>
+        <w:t>t</w:t>
+      </w:r>
+      <w:r>
+        <w:rPr>
+          <w:rFonts w:ascii="Segoe UI Emoji" w:hAnsi="Segoe UI Emoji" w:cs="Segoe UI Emoji"/>
+        </w:rPr>
+        <w:t>. Today, our team is proud to present the 'Temporary Rental Space Management System of MFU'."</w:t>
+      </w:r>
+    </w:p>
+    <w:p>
+      <w:pPr>
+        <w:rPr>
+          <w:rFonts w:ascii="Segoe UI Emoji" w:hAnsi="Segoe UI Emoji" w:cs="Segoe UI Emoji"/>
+        </w:rPr>
+      </w:pPr>
+      <w:r>
+        <w:rPr>
+          <w:rFonts w:ascii="Segoe UI Emoji" w:hAnsi="Segoe UI Emoji" w:cs="Segoe UI Emoji"/>
+          <w:b/>
+          <w:bCs/>
+        </w:rPr>
+        <w:t>☑ Slide 2: EXAMINING COMMITTEE</w:t>
+      </w:r>
+      <w:r>
+        <w:rPr>
+          <w:rFonts w:ascii="Segoe UI Emoji" w:hAnsi="Segoe UI Emoji" w:cs="Segoe UI Emoji"/>
+        </w:rPr>
+        <w:t xml:space="preserve"> </w:t>
+      </w:r>
+      <w:r>
+        <w:rPr>
+          <w:rFonts w:ascii="Segoe UI Emoji" w:hAnsi="Segoe UI Emoji" w:cs="Segoe UI Emoji"/>
+          <w:b/>
+          <w:bCs/>
+        </w:rPr>
+        <w:t>[</w:t>
+      </w:r>
+      <w:proofErr w:type="spellStart"/>
+      <w:r>
+        <w:rPr>
+          <w:rFonts w:ascii="Segoe UI Emoji" w:hAnsi="Segoe UI Emoji" w:cs="Segoe UI Emoji"/>
+          <w:b/>
+          <w:bCs/>
+        </w:rPr>
+        <w:t>Paniti</w:t>
+      </w:r>
+      <w:proofErr w:type="spellEnd"/>
+      <w:r>
+        <w:rPr>
+          <w:rFonts w:ascii="Segoe UI Emoji" w:hAnsi="Segoe UI Emoji" w:cs="Segoe UI Emoji"/>
+          <w:b/>
+          <w:bCs/>
+        </w:rPr>
+        <w:t>]</w:t>
+      </w:r>
+      <w:r>
+        <w:rPr>
+          <w:rFonts w:ascii="Segoe UI Emoji" w:hAnsi="Segoe UI Emoji" w:cs="Segoe UI Emoji"/>
+        </w:rPr>
+        <w:t xml:space="preserve"> "</w:t>
+      </w:r>
+      <w:r>
+        <w:rPr>
+          <w:rFonts w:ascii="Segoe UI Emoji" w:hAnsi="Segoe UI Emoji" w:cs="Segoe UI Emoji"/>
+        </w:rPr>
+        <w:t>This our examining committee</w:t>
+      </w:r>
+      <w:r>
+        <w:rPr>
+          <w:rFonts w:ascii="Segoe UI Emoji" w:hAnsi="Segoe UI Emoji" w:cs="Segoe UI Emoji"/>
+        </w:rPr>
+        <w:t>"</w:t>
+      </w:r>
+    </w:p>
+    <w:p>
+      <w:pPr>
+        <w:rPr>
+          <w:rFonts w:ascii="Segoe UI Emoji" w:hAnsi="Segoe UI Emoji" w:cs="Segoe UI Emoji"/>
+        </w:rPr>
+      </w:pPr>
+      <w:r>
+        <w:rPr>
+          <w:rFonts w:ascii="Segoe UI Emoji" w:hAnsi="Segoe UI Emoji" w:cs="Segoe UI Emoji"/>
+          <w:b/>
+          <w:bCs/>
+        </w:rPr>
+        <w:t>☑ Slide 3: PROJECT MEMBERS</w:t>
+      </w:r>
+      <w:r>
+        <w:rPr>
+          <w:rFonts w:ascii="Segoe UI Emoji" w:hAnsi="Segoe UI Emoji" w:cs="Segoe UI Emoji"/>
+        </w:rPr>
+        <w:t xml:space="preserve"> </w:t>
+      </w:r>
+      <w:r>
+        <w:rPr>
+          <w:rFonts w:ascii="Segoe UI Emoji" w:hAnsi="Segoe UI Emoji" w:cs="Segoe UI Emoji"/>
+          <w:b/>
+          <w:bCs/>
+        </w:rPr>
+        <w:t>[</w:t>
+      </w:r>
+      <w:proofErr w:type="spellStart"/>
+      <w:r>
+        <w:rPr>
+          <w:rFonts w:ascii="Segoe UI Emoji" w:hAnsi="Segoe UI Emoji" w:cs="Segoe UI Emoji"/>
+          <w:b/>
+          <w:bCs/>
+        </w:rPr>
+        <w:t>Paniti</w:t>
+      </w:r>
+      <w:proofErr w:type="spellEnd"/>
+      <w:r>
+        <w:rPr>
+          <w:rFonts w:ascii="Segoe UI Emoji" w:hAnsi="Segoe UI Emoji" w:cs="Segoe UI Emoji"/>
+          <w:b/>
+          <w:bCs/>
+        </w:rPr>
+        <w:t>]</w:t>
+      </w:r>
+      <w:r>
+        <w:rPr>
+          <w:rFonts w:ascii="Segoe UI Emoji" w:hAnsi="Segoe UI Emoji" w:cs="Segoe UI Emoji"/>
+        </w:rPr>
+        <w:t xml:space="preserve"> "Our team consists of four </w:t>
+      </w:r>
+      <w:r>
+        <w:rPr>
+          <w:rFonts w:ascii="Segoe UI Emoji" w:hAnsi="Segoe UI Emoji" w:cs="Segoe UI Emoji"/>
+        </w:rPr>
+        <w:t>peoples</w:t>
+      </w:r>
+      <w:r>
+        <w:rPr>
+          <w:rFonts w:ascii="Segoe UI Emoji" w:hAnsi="Segoe UI Emoji" w:cs="Segoe UI Emoji"/>
+        </w:rPr>
+        <w:t xml:space="preserve">: I am </w:t>
+      </w:r>
+      <w:proofErr w:type="spellStart"/>
+      <w:r>
+        <w:rPr>
+          <w:rFonts w:ascii="Segoe UI Emoji" w:hAnsi="Segoe UI Emoji" w:cs="Segoe UI Emoji"/>
+        </w:rPr>
+        <w:t>Paniti</w:t>
+      </w:r>
+      <w:proofErr w:type="spellEnd"/>
+      <w:r>
+        <w:rPr>
+          <w:rFonts w:ascii="Segoe UI Emoji" w:hAnsi="Segoe UI Emoji" w:cs="Segoe UI Emoji"/>
+        </w:rPr>
+        <w:t xml:space="preserve"> </w:t>
+      </w:r>
+      <w:proofErr w:type="spellStart"/>
+      <w:r>
+        <w:rPr>
+          <w:rFonts w:ascii="Segoe UI Emoji" w:hAnsi="Segoe UI Emoji" w:cs="Segoe UI Emoji"/>
+        </w:rPr>
+        <w:t>Konngoen</w:t>
+      </w:r>
+      <w:proofErr w:type="spellEnd"/>
+      <w:r>
+        <w:rPr>
+          <w:rFonts w:ascii="Segoe UI Emoji" w:hAnsi="Segoe UI Emoji" w:cs="Segoe UI Emoji"/>
+        </w:rPr>
+        <w:t xml:space="preserve">, acting as the Project Manager and Backend Developer. Joined by Mr. </w:t>
+      </w:r>
+      <w:proofErr w:type="spellStart"/>
+      <w:r>
+        <w:rPr>
+          <w:rFonts w:ascii="Segoe UI Emoji" w:hAnsi="Segoe UI Emoji" w:cs="Segoe UI Emoji"/>
+        </w:rPr>
+        <w:t>Prathanakorn</w:t>
+      </w:r>
+      <w:proofErr w:type="spellEnd"/>
+      <w:r>
+        <w:rPr>
+          <w:rFonts w:ascii="Segoe UI Emoji" w:hAnsi="Segoe UI Emoji" w:cs="Segoe UI Emoji"/>
+        </w:rPr>
+        <w:t xml:space="preserve"> Piti, our Frontend Developer; Miss </w:t>
+      </w:r>
+      <w:proofErr w:type="spellStart"/>
+      <w:r>
+        <w:rPr>
+          <w:rFonts w:ascii="Segoe UI Emoji" w:hAnsi="Segoe UI Emoji" w:cs="Segoe UI Emoji"/>
+        </w:rPr>
+        <w:t>Phloiphailin</w:t>
+      </w:r>
+      <w:proofErr w:type="spellEnd"/>
+      <w:r>
+        <w:rPr>
+          <w:rFonts w:ascii="Segoe UI Emoji" w:hAnsi="Segoe UI Emoji" w:cs="Segoe UI Emoji"/>
+        </w:rPr>
+        <w:t xml:space="preserve"> Khampuk, our System Analyst and UX/UI Designer; and Mr. </w:t>
+      </w:r>
+      <w:proofErr w:type="spellStart"/>
+      <w:r>
+        <w:rPr>
+          <w:rFonts w:ascii="Segoe UI Emoji" w:hAnsi="Segoe UI Emoji" w:cs="Segoe UI Emoji"/>
+        </w:rPr>
+        <w:t>Phongsaphak</w:t>
+      </w:r>
+      <w:proofErr w:type="spellEnd"/>
+      <w:r>
+        <w:rPr>
+          <w:rFonts w:ascii="Segoe UI Emoji" w:hAnsi="Segoe UI Emoji" w:cs="Segoe UI Emoji"/>
+        </w:rPr>
+        <w:t xml:space="preserve"> Duangnet, our Database Administrator and QA. Now, </w:t>
+      </w:r>
+      <w:proofErr w:type="spellStart"/>
+      <w:r>
+        <w:rPr>
+          <w:rFonts w:ascii="Segoe UI Emoji" w:hAnsi="Segoe UI Emoji" w:cs="Segoe UI Emoji"/>
+        </w:rPr>
+        <w:t>Prathanakorn</w:t>
+      </w:r>
+      <w:proofErr w:type="spellEnd"/>
+      <w:r>
+        <w:rPr>
+          <w:rFonts w:ascii="Segoe UI Emoji" w:hAnsi="Segoe UI Emoji" w:cs="Segoe UI Emoji"/>
+        </w:rPr>
+        <w:t xml:space="preserve"> will start with Chapter 1. Over to you, </w:t>
+      </w:r>
+      <w:proofErr w:type="spellStart"/>
+      <w:r>
+        <w:rPr>
+          <w:rFonts w:ascii="Segoe UI Emoji" w:hAnsi="Segoe UI Emoji" w:cs="Segoe UI Emoji"/>
+        </w:rPr>
+        <w:t>Prathanakorn</w:t>
+      </w:r>
+      <w:proofErr w:type="spellEnd"/>
+      <w:r>
+        <w:rPr>
+          <w:rFonts w:ascii="Segoe UI Emoji" w:hAnsi="Segoe UI Emoji" w:cs="Segoe UI Emoji"/>
+        </w:rPr>
+        <w:t>."</w:t>
+      </w:r>
+    </w:p>
+    <w:p>
+      <w:pPr>
+        <w:rPr>
+          <w:rFonts w:ascii="Segoe UI Emoji" w:hAnsi="Segoe UI Emoji" w:cs="Segoe UI Emoji"/>
+        </w:rPr>
+      </w:pPr>
+      <w:r>
+        <w:rPr>
+          <w:rFonts w:ascii="Segoe UI Emoji" w:hAnsi="Segoe UI Emoji" w:cs="Segoe UI Emoji"/>
+        </w:rPr>
+        <w:pict w14:anchorId="621D2102">
+          <v:rect id="_x0000_i1061" style="width:0;height:1.5pt" o:hralign="center" o:hrstd="t" o:hr="t" fillcolor="#a0a0a0" stroked="f"/>
+        </w:pict>
+      </w:r>
+    </w:p>
+    <w:p>
+      <w:pPr>
+        <w:rPr>
+          <w:rFonts w:ascii="Segoe UI Emoji" w:hAnsi="Segoe UI Emoji" w:cs="Segoe UI Emoji"/>
+          <w:b/>
+          <w:bCs/>
+        </w:rPr>
+      </w:pPr>
+      <w:r>
+        <w:rPr>
+          <w:rFonts w:ascii="Segoe UI Emoji" w:hAnsi="Segoe UI Emoji" w:cs="Segoe UI Emoji"/>
+          <w:b/>
+          <w:bCs/>
+        </w:rPr>
+        <w:t>🟢 CHAPTER 1: INTRODUCTION (~3 Minutes)</w:t>
+      </w:r>
+    </w:p>
+    <w:p>
+      <w:pPr>
+        <w:rPr>
+          <w:rFonts w:ascii="Segoe UI Emoji" w:hAnsi="Segoe UI Emoji" w:cs="Segoe UI Emoji"/>
+        </w:rPr>
+      </w:pPr>
+      <w:r>
+        <w:rPr>
+          <w:rFonts w:ascii="Segoe UI Emoji" w:hAnsi="Segoe UI Emoji" w:cs="Segoe UI Emoji"/>
+          <w:b/>
+          <w:bCs/>
+        </w:rPr>
+        <w:t>☑ Slide 4: INTRODUCTION</w:t>
+      </w:r>
+      <w:r>
+        <w:rPr>
+          <w:rFonts w:ascii="Segoe UI Emoji" w:hAnsi="Segoe UI Emoji" w:cs="Segoe UI Emoji"/>
+        </w:rPr>
+        <w:t xml:space="preserve"> </w:t>
+      </w:r>
+      <w:r>
+        <w:rPr>
+          <w:rFonts w:ascii="Segoe UI Emoji" w:hAnsi="Segoe UI Emoji" w:cs="Segoe UI Emoji"/>
+          <w:b/>
+          <w:bCs/>
+        </w:rPr>
+        <w:t>[</w:t>
+      </w:r>
+      <w:proofErr w:type="spellStart"/>
+      <w:r>
+        <w:rPr>
+          <w:rFonts w:ascii="Segoe UI Emoji" w:hAnsi="Segoe UI Emoji" w:cs="Segoe UI Emoji"/>
+          <w:b/>
+          <w:bCs/>
+        </w:rPr>
+        <w:t>Prathanakorn</w:t>
+      </w:r>
+      <w:proofErr w:type="spellEnd"/>
+      <w:r>
+        <w:rPr>
+          <w:rFonts w:ascii="Segoe UI Emoji" w:hAnsi="Segoe UI Emoji" w:cs="Segoe UI Emoji"/>
+          <w:b/>
+          <w:bCs/>
+        </w:rPr>
+        <w:t>]</w:t>
+      </w:r>
+      <w:r>
+        <w:rPr>
+          <w:rFonts w:ascii="Segoe UI Emoji" w:hAnsi="Segoe UI Emoji" w:cs="Segoe UI Emoji"/>
+        </w:rPr>
+        <w:t xml:space="preserve"> "Thank you, </w:t>
+      </w:r>
+      <w:proofErr w:type="spellStart"/>
+      <w:r>
+        <w:rPr>
+          <w:rFonts w:ascii="Segoe UI Emoji" w:hAnsi="Segoe UI Emoji" w:cs="Segoe UI Emoji"/>
+        </w:rPr>
+        <w:t>Paniti</w:t>
+      </w:r>
+      <w:proofErr w:type="spellEnd"/>
+      <w:r>
+        <w:rPr>
+          <w:rFonts w:ascii="Segoe UI Emoji" w:hAnsi="Segoe UI Emoji" w:cs="Segoe UI Emoji"/>
+        </w:rPr>
+        <w:t>. Let's begin with Chapter 1: The background and rationale of our project. Currently, the Property Management Division at MFU handles space reservations using a manual, paper-based workflow. This traditional method causes several critical issues: scheduling conflicts, delayed communications, and a heavy administrative burden, especially when coordinating financial transactions with external commercial clients. Our solution is to develop a comprehensive, fully automated web-based platform to digitize this entire workflow."</w:t>
+      </w:r>
+    </w:p>
+    <w:p>
+      <w:pPr>
+        <w:rPr>
+          <w:rFonts w:ascii="Segoe UI Emoji" w:hAnsi="Segoe UI Emoji" w:cs="Segoe UI Emoji"/>
+        </w:rPr>
+      </w:pPr>
+      <w:r>
+        <w:rPr>
+          <w:rFonts w:ascii="Segoe UI Emoji" w:hAnsi="Segoe UI Emoji" w:cs="Segoe UI Emoji"/>
+          <w:b/>
+          <w:bCs/>
+        </w:rPr>
+        <w:t>☑ Slide 5: PROJECT OBJECTIVES</w:t>
+      </w:r>
+      <w:r>
+        <w:rPr>
+          <w:rFonts w:ascii="Segoe UI Emoji" w:hAnsi="Segoe UI Emoji" w:cs="Segoe UI Emoji"/>
+        </w:rPr>
+        <w:t xml:space="preserve"> </w:t>
+      </w:r>
+      <w:r>
+        <w:rPr>
+          <w:rFonts w:ascii="Segoe UI Emoji" w:hAnsi="Segoe UI Emoji" w:cs="Segoe UI Emoji"/>
+          <w:b/>
+          <w:bCs/>
+        </w:rPr>
+        <w:t>[</w:t>
+      </w:r>
+      <w:proofErr w:type="spellStart"/>
+      <w:r>
+        <w:rPr>
+          <w:rFonts w:ascii="Segoe UI Emoji" w:hAnsi="Segoe UI Emoji" w:cs="Segoe UI Emoji"/>
+          <w:b/>
+          <w:bCs/>
+        </w:rPr>
+        <w:t>Prathanakorn</w:t>
+      </w:r>
+      <w:proofErr w:type="spellEnd"/>
+      <w:r>
+        <w:rPr>
+          <w:rFonts w:ascii="Segoe UI Emoji" w:hAnsi="Segoe UI Emoji" w:cs="Segoe UI Emoji"/>
+          <w:b/>
+          <w:bCs/>
+        </w:rPr>
+        <w:t>]</w:t>
+      </w:r>
+      <w:r>
+        <w:rPr>
+          <w:rFonts w:ascii="Segoe UI Emoji" w:hAnsi="Segoe UI Emoji" w:cs="Segoe UI Emoji"/>
+        </w:rPr>
+        <w:t xml:space="preserve"> "Our project is driven by three main objectives:</w:t>
+      </w:r>
+    </w:p>
+    <w:p>
+      <w:pPr>
         <w:numPr>
           <w:ilvl w:val="0"/>
-          <w:numId w:val="1"/>
+          <w:numId w:val="9"/>
         </w:numPr>
-      </w:pPr>
-      <w:r>
-        <w:t xml:space="preserve">"Hello everyone! </w:t>
-      </w:r>
-      <w:r>
-        <w:t xml:space="preserve"> </w:t>
-      </w:r>
-      <w:r>
-        <w:t xml:space="preserve">Welcome to our senior project presentation. Today, we're really excited to show you the </w:t>
-      </w:r>
-      <w:r>
-        <w:rPr>
-          <w:b/>
-          <w:bCs/>
-        </w:rPr>
-        <w:t>Temporary Rental Space Management System for Mae Fah Luang University</w:t>
-      </w:r>
-      <w:r>
-        <w:t xml:space="preserve">, which we also call </w:t>
-      </w:r>
-      <w:r>
-        <w:rPr>
-          <w:b/>
-          <w:bCs/>
-        </w:rPr>
-        <w:t>MFU Property Reservation</w:t>
-      </w:r>
-      <w:r>
-        <w:t>."</w:t>
+        <w:rPr>
+          <w:rFonts w:ascii="Segoe UI Emoji" w:hAnsi="Segoe UI Emoji" w:cs="Segoe UI Emoji"/>
+        </w:rPr>
+      </w:pPr>
+      <w:r>
+        <w:rPr>
+          <w:rFonts w:ascii="Segoe UI Emoji" w:hAnsi="Segoe UI Emoji" w:cs="Segoe UI Emoji"/>
+        </w:rPr>
+        <w:t>To develop a fully functional web-based room reservation system for the university.</w:t>
       </w:r>
     </w:p>
     <w:p>
       <w:pPr>
         <w:numPr>
           <w:ilvl w:val="0"/>
-          <w:numId w:val="1"/>
+          <w:numId w:val="9"/>
         </w:numPr>
-      </w:pPr>
-      <w:r>
-        <w:t xml:space="preserve">"Our team has four members: I'm </w:t>
-      </w:r>
-      <w:proofErr w:type="spellStart"/>
-      <w:r>
-        <w:t>Paniti</w:t>
-      </w:r>
-      <w:proofErr w:type="spellEnd"/>
-      <w:r>
-        <w:t xml:space="preserve">, and my teammates are </w:t>
-      </w:r>
-      <w:proofErr w:type="spellStart"/>
-      <w:r>
-        <w:t>Prathanakorn</w:t>
-      </w:r>
-      <w:proofErr w:type="spellEnd"/>
-      <w:r>
-        <w:t xml:space="preserve">, </w:t>
-      </w:r>
-      <w:proofErr w:type="spellStart"/>
-      <w:r>
-        <w:t>Phloiphailin</w:t>
-      </w:r>
-      <w:proofErr w:type="spellEnd"/>
-      <w:r>
-        <w:t xml:space="preserve">, and </w:t>
-      </w:r>
-      <w:proofErr w:type="spellStart"/>
-      <w:proofErr w:type="gramStart"/>
-      <w:r>
-        <w:t>Phongsaphak</w:t>
-      </w:r>
-      <w:proofErr w:type="spellEnd"/>
-      <w:r>
-        <w:t xml:space="preserve"> .</w:t>
-      </w:r>
-      <w:proofErr w:type="gramEnd"/>
-      <w:r>
-        <w:t>"</w:t>
+        <w:rPr>
+          <w:rFonts w:ascii="Segoe UI Emoji" w:hAnsi="Segoe UI Emoji" w:cs="Segoe UI Emoji"/>
+        </w:rPr>
+      </w:pPr>
+      <w:r>
+        <w:rPr>
+          <w:rFonts w:ascii="Segoe UI Emoji" w:hAnsi="Segoe UI Emoji" w:cs="Segoe UI Emoji"/>
+        </w:rPr>
+        <w:t>To implement a full-stack system architecture, demonstrating seamless integration between frontend interfaces and backend APIs.</w:t>
       </w:r>
     </w:p>
     <w:p>
-      <w:r>
-        <w:rPr>
-          <w:b/>
-          <w:bCs/>
-        </w:rPr>
-        <w:t>[Slide 2-3: Background &amp; Problem]</w:t>
+      <w:pPr>
+        <w:numPr>
+          <w:ilvl w:val="0"/>
+          <w:numId w:val="9"/>
+        </w:numPr>
+        <w:rPr>
+          <w:rFonts w:ascii="Segoe UI Emoji" w:hAnsi="Segoe UI Emoji" w:cs="Segoe UI Emoji"/>
+        </w:rPr>
+      </w:pPr>
+      <w:r>
+        <w:rPr>
+          <w:rFonts w:ascii="Segoe UI Emoji" w:hAnsi="Segoe UI Emoji" w:cs="Segoe UI Emoji"/>
+        </w:rPr>
+        <w:t xml:space="preserve">To enable secure online bookings for all users and provide administrators with a centralized dashboard to maximize operational efficiency." "Next, </w:t>
+      </w:r>
+      <w:proofErr w:type="spellStart"/>
+      <w:r>
+        <w:rPr>
+          <w:rFonts w:ascii="Segoe UI Emoji" w:hAnsi="Segoe UI Emoji" w:cs="Segoe UI Emoji"/>
+        </w:rPr>
+        <w:t>Phloiphailin</w:t>
+      </w:r>
+      <w:proofErr w:type="spellEnd"/>
+      <w:r>
+        <w:rPr>
+          <w:rFonts w:ascii="Segoe UI Emoji" w:hAnsi="Segoe UI Emoji" w:cs="Segoe UI Emoji"/>
+        </w:rPr>
+        <w:t xml:space="preserve"> will explain the Scope of Work. </w:t>
+      </w:r>
+      <w:proofErr w:type="spellStart"/>
+      <w:r>
+        <w:rPr>
+          <w:rFonts w:ascii="Segoe UI Emoji" w:hAnsi="Segoe UI Emoji" w:cs="Segoe UI Emoji"/>
+        </w:rPr>
+        <w:t>Phloiphailin</w:t>
+      </w:r>
+      <w:proofErr w:type="spellEnd"/>
+      <w:r>
+        <w:rPr>
+          <w:rFonts w:ascii="Segoe UI Emoji" w:hAnsi="Segoe UI Emoji" w:cs="Segoe UI Emoji"/>
+        </w:rPr>
+        <w:t>, please."</w:t>
       </w:r>
     </w:p>
     <w:p>
-      <w:r>
-        <w:rPr>
-          <w:b/>
-          <w:bCs/>
-        </w:rPr>
-        <w:t xml:space="preserve">(Presenter 1: </w:t>
-      </w:r>
-      <w:proofErr w:type="spellStart"/>
-      <w:r>
-        <w:rPr>
-          <w:b/>
-          <w:bCs/>
-        </w:rPr>
-        <w:t>Paniti</w:t>
-      </w:r>
-      <w:proofErr w:type="spellEnd"/>
-      <w:r>
-        <w:rPr>
-          <w:b/>
-          <w:bCs/>
-        </w:rPr>
-        <w:t>)</w:t>
+      <w:pPr>
+        <w:rPr>
+          <w:rFonts w:ascii="Segoe UI Emoji" w:hAnsi="Segoe UI Emoji" w:cs="Segoe UI Emoji"/>
+        </w:rPr>
+      </w:pPr>
+      <w:r>
+        <w:rPr>
+          <w:rFonts w:ascii="Segoe UI Emoji" w:hAnsi="Segoe UI Emoji" w:cs="Segoe UI Emoji"/>
+        </w:rPr>
+        <w:br w:type="page"/>
       </w:r>
     </w:p>
     <w:p>
       <w:pPr>
+        <w:rPr>
+          <w:rFonts w:ascii="Segoe UI Emoji" w:hAnsi="Segoe UI Emoji" w:cs="Segoe UI Emoji"/>
+        </w:rPr>
+      </w:pPr>
+      <w:r>
+        <w:rPr>
+          <w:rFonts w:ascii="Segoe UI Emoji" w:hAnsi="Segoe UI Emoji" w:cs="Segoe UI Emoji"/>
+          <w:b/>
+          <w:bCs/>
+        </w:rPr>
+        <w:lastRenderedPageBreak/>
+        <w:t>☑ Slide 6: SCOPE OF WORK - SYSTEM USERS</w:t>
+      </w:r>
+      <w:r>
+        <w:rPr>
+          <w:rFonts w:ascii="Segoe UI Emoji" w:hAnsi="Segoe UI Emoji" w:cs="Segoe UI Emoji"/>
+        </w:rPr>
+        <w:t xml:space="preserve"> </w:t>
+      </w:r>
+      <w:r>
+        <w:rPr>
+          <w:rFonts w:ascii="Segoe UI Emoji" w:hAnsi="Segoe UI Emoji" w:cs="Segoe UI Emoji"/>
+          <w:b/>
+          <w:bCs/>
+        </w:rPr>
+        <w:t>[</w:t>
+      </w:r>
+      <w:proofErr w:type="spellStart"/>
+      <w:r>
+        <w:rPr>
+          <w:rFonts w:ascii="Segoe UI Emoji" w:hAnsi="Segoe UI Emoji" w:cs="Segoe UI Emoji"/>
+          <w:b/>
+          <w:bCs/>
+        </w:rPr>
+        <w:t>Phloiphailin</w:t>
+      </w:r>
+      <w:proofErr w:type="spellEnd"/>
+      <w:r>
+        <w:rPr>
+          <w:rFonts w:ascii="Segoe UI Emoji" w:hAnsi="Segoe UI Emoji" w:cs="Segoe UI Emoji"/>
+          <w:b/>
+          <w:bCs/>
+        </w:rPr>
+        <w:t>]</w:t>
+      </w:r>
+      <w:r>
+        <w:rPr>
+          <w:rFonts w:ascii="Segoe UI Emoji" w:hAnsi="Segoe UI Emoji" w:cs="Segoe UI Emoji"/>
+        </w:rPr>
+        <w:t xml:space="preserve"> "Thank you. Moving on to the Scope of Work. We categorize our system users into three distinct authorization levels: First, </w:t>
+      </w:r>
+      <w:r>
+        <w:rPr>
+          <w:rFonts w:ascii="Segoe UI Emoji" w:hAnsi="Segoe UI Emoji" w:cs="Segoe UI Emoji"/>
+          <w:b/>
+          <w:bCs/>
+        </w:rPr>
+        <w:t>Internal Users</w:t>
+      </w:r>
+      <w:r>
+        <w:rPr>
+          <w:rFonts w:ascii="Segoe UI Emoji" w:hAnsi="Segoe UI Emoji" w:cs="Segoe UI Emoji"/>
+        </w:rPr>
+        <w:t xml:space="preserve"> (staff and students). Second, </w:t>
+      </w:r>
+      <w:r>
+        <w:rPr>
+          <w:rFonts w:ascii="Segoe UI Emoji" w:hAnsi="Segoe UI Emoji" w:cs="Segoe UI Emoji"/>
+          <w:b/>
+          <w:bCs/>
+        </w:rPr>
+        <w:t>External Users</w:t>
+      </w:r>
+      <w:r>
+        <w:rPr>
+          <w:rFonts w:ascii="Segoe UI Emoji" w:hAnsi="Segoe UI Emoji" w:cs="Segoe UI Emoji"/>
+        </w:rPr>
+        <w:t xml:space="preserve"> (outside companies). And third, </w:t>
+      </w:r>
+      <w:r>
+        <w:rPr>
+          <w:rFonts w:ascii="Segoe UI Emoji" w:hAnsi="Segoe UI Emoji" w:cs="Segoe UI Emoji"/>
+          <w:b/>
+          <w:bCs/>
+        </w:rPr>
+        <w:t>Collaborative Users</w:t>
+      </w:r>
+      <w:r>
+        <w:rPr>
+          <w:rFonts w:ascii="Segoe UI Emoji" w:hAnsi="Segoe UI Emoji" w:cs="Segoe UI Emoji"/>
+        </w:rPr>
+        <w:t xml:space="preserve"> (cross-organizational partnerships). The system uses these roles to automatically apply different rental pricing tiers based on university policies."</w:t>
+      </w:r>
+    </w:p>
+    <w:p>
+      <w:pPr>
+        <w:rPr>
+          <w:rFonts w:ascii="Segoe UI Emoji" w:hAnsi="Segoe UI Emoji" w:cs="Segoe UI Emoji"/>
+        </w:rPr>
+      </w:pPr>
+      <w:r>
+        <w:rPr>
+          <w:rFonts w:ascii="Segoe UI Emoji" w:hAnsi="Segoe UI Emoji" w:cs="Segoe UI Emoji"/>
+          <w:b/>
+          <w:bCs/>
+        </w:rPr>
+        <w:t>☑ Slide 7: SCOPE OF WORK - USER FUNCTIONALITIES</w:t>
+      </w:r>
+      <w:r>
+        <w:rPr>
+          <w:rFonts w:ascii="Segoe UI Emoji" w:hAnsi="Segoe UI Emoji" w:cs="Segoe UI Emoji"/>
+        </w:rPr>
+        <w:t xml:space="preserve"> </w:t>
+      </w:r>
+      <w:r>
+        <w:rPr>
+          <w:rFonts w:ascii="Segoe UI Emoji" w:hAnsi="Segoe UI Emoji" w:cs="Segoe UI Emoji"/>
+          <w:b/>
+          <w:bCs/>
+        </w:rPr>
+        <w:t>[</w:t>
+      </w:r>
+      <w:proofErr w:type="spellStart"/>
+      <w:r>
+        <w:rPr>
+          <w:rFonts w:ascii="Segoe UI Emoji" w:hAnsi="Segoe UI Emoji" w:cs="Segoe UI Emoji"/>
+          <w:b/>
+          <w:bCs/>
+        </w:rPr>
+        <w:t>Phloiphailin</w:t>
+      </w:r>
+      <w:proofErr w:type="spellEnd"/>
+      <w:r>
+        <w:rPr>
+          <w:rFonts w:ascii="Segoe UI Emoji" w:hAnsi="Segoe UI Emoji" w:cs="Segoe UI Emoji"/>
+          <w:b/>
+          <w:bCs/>
+        </w:rPr>
+        <w:t>]</w:t>
+      </w:r>
+      <w:r>
+        <w:rPr>
+          <w:rFonts w:ascii="Segoe UI Emoji" w:hAnsi="Segoe UI Emoji" w:cs="Segoe UI Emoji"/>
+        </w:rPr>
+        <w:t xml:space="preserve"> "For the User Functional Scope, individuals can perform real-time availability searches. During the booking process, they can customize their requests by selecting service add-ons—like microphones or extra chairs—and the system will calculate the total cost automatically. Most importantly, users can securely process their payments online, track their live booking status, and submit post-service feedback." "I will now pass the floor to </w:t>
+      </w:r>
+      <w:proofErr w:type="spellStart"/>
+      <w:r>
+        <w:rPr>
+          <w:rFonts w:ascii="Segoe UI Emoji" w:hAnsi="Segoe UI Emoji" w:cs="Segoe UI Emoji"/>
+        </w:rPr>
+        <w:t>Phongsaphak</w:t>
+      </w:r>
+      <w:proofErr w:type="spellEnd"/>
+      <w:r>
+        <w:rPr>
+          <w:rFonts w:ascii="Segoe UI Emoji" w:hAnsi="Segoe UI Emoji" w:cs="Segoe UI Emoji"/>
+        </w:rPr>
+        <w:t xml:space="preserve"> to discuss the Administrator Controls."</w:t>
+      </w:r>
+    </w:p>
+    <w:p>
+      <w:pPr>
+        <w:rPr>
+          <w:rFonts w:ascii="Segoe UI Emoji" w:hAnsi="Segoe UI Emoji" w:cs="Segoe UI Emoji"/>
+        </w:rPr>
+      </w:pPr>
+      <w:r>
+        <w:rPr>
+          <w:rFonts w:ascii="Segoe UI Emoji" w:hAnsi="Segoe UI Emoji" w:cs="Segoe UI Emoji"/>
+          <w:b/>
+          <w:bCs/>
+        </w:rPr>
+        <w:t>☑ Slide 8: SCOPE OF WORK - ADMINISTRATOR CONTROLS</w:t>
+      </w:r>
+      <w:r>
+        <w:rPr>
+          <w:rFonts w:ascii="Segoe UI Emoji" w:hAnsi="Segoe UI Emoji" w:cs="Segoe UI Emoji"/>
+        </w:rPr>
+        <w:t xml:space="preserve"> </w:t>
+      </w:r>
+      <w:r>
+        <w:rPr>
+          <w:rFonts w:ascii="Segoe UI Emoji" w:hAnsi="Segoe UI Emoji" w:cs="Segoe UI Emoji"/>
+          <w:b/>
+          <w:bCs/>
+        </w:rPr>
+        <w:t>[</w:t>
+      </w:r>
+      <w:proofErr w:type="spellStart"/>
+      <w:r>
+        <w:rPr>
+          <w:rFonts w:ascii="Segoe UI Emoji" w:hAnsi="Segoe UI Emoji" w:cs="Segoe UI Emoji"/>
+          <w:b/>
+          <w:bCs/>
+        </w:rPr>
+        <w:t>Phongsaphak</w:t>
+      </w:r>
+      <w:proofErr w:type="spellEnd"/>
+      <w:r>
+        <w:rPr>
+          <w:rFonts w:ascii="Segoe UI Emoji" w:hAnsi="Segoe UI Emoji" w:cs="Segoe UI Emoji"/>
+          <w:b/>
+          <w:bCs/>
+        </w:rPr>
+        <w:t>]</w:t>
+      </w:r>
+      <w:r>
+        <w:rPr>
+          <w:rFonts w:ascii="Segoe UI Emoji" w:hAnsi="Segoe UI Emoji" w:cs="Segoe UI Emoji"/>
+        </w:rPr>
+        <w:t xml:space="preserve"> "Thank you. For the Administrator Scope, we provide a centralized dashboard. Admins can manage facility details and pricing structures, featuring a bulk import tool using Excel files. The dashboard includes interactive data visualization to monitor revenue and room utilization. Additionally, admins have full control over approval workflows, document management, and promotional broadcasts."</w:t>
+      </w:r>
+    </w:p>
+    <w:p>
+      <w:pPr>
+        <w:rPr>
+          <w:rFonts w:ascii="Segoe UI Emoji" w:hAnsi="Segoe UI Emoji" w:cs="Segoe UI Emoji"/>
+        </w:rPr>
+      </w:pPr>
+      <w:r>
+        <w:rPr>
+          <w:rFonts w:ascii="Segoe UI Emoji" w:hAnsi="Segoe UI Emoji" w:cs="Segoe UI Emoji"/>
+          <w:b/>
+          <w:bCs/>
+        </w:rPr>
+        <w:t>☑ Slide 9 &amp; 10: INTEGRATIONS &amp; WORKFLOW</w:t>
+      </w:r>
+      <w:r>
+        <w:rPr>
+          <w:rFonts w:ascii="Segoe UI Emoji" w:hAnsi="Segoe UI Emoji" w:cs="Segoe UI Emoji"/>
+        </w:rPr>
+        <w:t xml:space="preserve"> </w:t>
+      </w:r>
+      <w:r>
+        <w:rPr>
+          <w:rFonts w:ascii="Segoe UI Emoji" w:hAnsi="Segoe UI Emoji" w:cs="Segoe UI Emoji"/>
+          <w:b/>
+          <w:bCs/>
+        </w:rPr>
+        <w:t>[</w:t>
+      </w:r>
+      <w:proofErr w:type="spellStart"/>
+      <w:r>
+        <w:rPr>
+          <w:rFonts w:ascii="Segoe UI Emoji" w:hAnsi="Segoe UI Emoji" w:cs="Segoe UI Emoji"/>
+          <w:b/>
+          <w:bCs/>
+        </w:rPr>
+        <w:t>Phongsaphak</w:t>
+      </w:r>
+      <w:proofErr w:type="spellEnd"/>
+      <w:r>
+        <w:rPr>
+          <w:rFonts w:ascii="Segoe UI Emoji" w:hAnsi="Segoe UI Emoji" w:cs="Segoe UI Emoji"/>
+          <w:b/>
+          <w:bCs/>
+        </w:rPr>
+        <w:t>]</w:t>
+      </w:r>
+      <w:r>
+        <w:rPr>
+          <w:rFonts w:ascii="Segoe UI Emoji" w:hAnsi="Segoe UI Emoji" w:cs="Segoe UI Emoji"/>
+        </w:rPr>
+        <w:t xml:space="preserve"> "To ensure high security, our system integrates two major third-party services. We use </w:t>
+      </w:r>
+      <w:r>
+        <w:rPr>
+          <w:rFonts w:ascii="Segoe UI Emoji" w:hAnsi="Segoe UI Emoji" w:cs="Segoe UI Emoji"/>
+          <w:b/>
+          <w:bCs/>
+        </w:rPr>
+        <w:t>Google OAuth</w:t>
+      </w:r>
+      <w:r>
+        <w:rPr>
+          <w:rFonts w:ascii="Segoe UI Emoji" w:hAnsi="Segoe UI Emoji" w:cs="Segoe UI Emoji"/>
+        </w:rPr>
+        <w:t xml:space="preserve"> for Single Sign-On, which automatically assigns user roles based on their email domains (</w:t>
+      </w:r>
+      <w:proofErr w:type="gramStart"/>
+      <w:r>
+        <w:rPr>
+          <w:rFonts w:ascii="Segoe UI Emoji" w:hAnsi="Segoe UI Emoji" w:cs="Segoe UI Emoji"/>
+        </w:rPr>
+        <w:t>like @mfu.ac.th</w:t>
+      </w:r>
+      <w:proofErr w:type="gramEnd"/>
+      <w:r>
+        <w:rPr>
+          <w:rFonts w:ascii="Segoe UI Emoji" w:hAnsi="Segoe UI Emoji" w:cs="Segoe UI Emoji"/>
+        </w:rPr>
+        <w:t xml:space="preserve">). For payments, we chose </w:t>
+      </w:r>
+      <w:proofErr w:type="spellStart"/>
+      <w:r>
+        <w:rPr>
+          <w:rFonts w:ascii="Segoe UI Emoji" w:hAnsi="Segoe UI Emoji" w:cs="Segoe UI Emoji"/>
+          <w:b/>
+          <w:bCs/>
+        </w:rPr>
+        <w:t>Opn</w:t>
+      </w:r>
+      <w:proofErr w:type="spellEnd"/>
+      <w:r>
+        <w:rPr>
+          <w:rFonts w:ascii="Segoe UI Emoji" w:hAnsi="Segoe UI Emoji" w:cs="Segoe UI Emoji"/>
+          <w:b/>
+          <w:bCs/>
+        </w:rPr>
+        <w:t xml:space="preserve"> Payments</w:t>
+      </w:r>
+      <w:r>
+        <w:rPr>
+          <w:rFonts w:ascii="Segoe UI Emoji" w:hAnsi="Segoe UI Emoji" w:cs="Segoe UI Emoji"/>
+        </w:rPr>
+        <w:t xml:space="preserve"> to generate dynamic </w:t>
+      </w:r>
+      <w:proofErr w:type="spellStart"/>
+      <w:r>
+        <w:rPr>
+          <w:rFonts w:ascii="Segoe UI Emoji" w:hAnsi="Segoe UI Emoji" w:cs="Segoe UI Emoji"/>
+        </w:rPr>
+        <w:t>PromptPay</w:t>
+      </w:r>
+      <w:proofErr w:type="spellEnd"/>
+      <w:r>
+        <w:rPr>
+          <w:rFonts w:ascii="Segoe UI Emoji" w:hAnsi="Segoe UI Emoji" w:cs="Segoe UI Emoji"/>
+        </w:rPr>
+        <w:t xml:space="preserve"> QR Codes, ensuring secure and instant transactions. Overall, our system workflow ensures a seamless transition from user requests to executive approvals, triggering real-time automated alerts at every step."</w:t>
+      </w:r>
+    </w:p>
+    <w:p>
+      <w:pPr>
+        <w:rPr>
+          <w:rFonts w:ascii="Segoe UI Emoji" w:hAnsi="Segoe UI Emoji" w:cs="Segoe UI Emoji"/>
+        </w:rPr>
+      </w:pPr>
+      <w:r>
+        <w:rPr>
+          <w:rFonts w:ascii="Segoe UI Emoji" w:hAnsi="Segoe UI Emoji" w:cs="Segoe UI Emoji"/>
+        </w:rPr>
+        <w:pict w14:anchorId="12883B3F">
+          <v:rect id="_x0000_i1062" style="width:0;height:1.5pt" o:hralign="center" o:hrstd="t" o:hr="t" fillcolor="#a0a0a0" stroked="f"/>
+        </w:pict>
+      </w:r>
+    </w:p>
+    <w:p>
+      <w:pPr>
+        <w:rPr>
+          <w:rFonts w:ascii="Segoe UI Emoji" w:hAnsi="Segoe UI Emoji" w:cs="Segoe UI Emoji"/>
+          <w:b/>
+          <w:bCs/>
+        </w:rPr>
+      </w:pPr>
+      <w:r>
+        <w:rPr>
+          <w:rFonts w:ascii="Segoe UI Emoji" w:hAnsi="Segoe UI Emoji" w:cs="Segoe UI Emoji"/>
+          <w:b/>
+          <w:bCs/>
+        </w:rPr>
+        <w:t>🟢 CHAPTER 2: LITERATURE REVIEW (~5 Minutes)</w:t>
+      </w:r>
+    </w:p>
+    <w:p>
+      <w:pPr>
+        <w:rPr>
+          <w:rFonts w:ascii="Segoe UI Emoji" w:hAnsi="Segoe UI Emoji" w:cs="Segoe UI Emoji"/>
+        </w:rPr>
+      </w:pPr>
+      <w:r>
+        <w:rPr>
+          <w:rFonts w:ascii="Segoe UI Emoji" w:hAnsi="Segoe UI Emoji" w:cs="Segoe UI Emoji"/>
+          <w:b/>
+          <w:bCs/>
+        </w:rPr>
+        <w:t>☑ Slide 11: LITERATURE REVIEW - EXISTING VS PROPOSED SYSTEM</w:t>
+      </w:r>
+      <w:r>
+        <w:rPr>
+          <w:rFonts w:ascii="Segoe UI Emoji" w:hAnsi="Segoe UI Emoji" w:cs="Segoe UI Emoji"/>
+        </w:rPr>
+        <w:t xml:space="preserve"> </w:t>
+      </w:r>
+      <w:r>
+        <w:rPr>
+          <w:rFonts w:ascii="Segoe UI Emoji" w:hAnsi="Segoe UI Emoji" w:cs="Segoe UI Emoji"/>
+          <w:b/>
+          <w:bCs/>
+        </w:rPr>
+        <w:t>[</w:t>
+      </w:r>
+      <w:proofErr w:type="spellStart"/>
+      <w:r>
+        <w:rPr>
+          <w:rFonts w:ascii="Segoe UI Emoji" w:hAnsi="Segoe UI Emoji" w:cs="Segoe UI Emoji"/>
+          <w:b/>
+          <w:bCs/>
+        </w:rPr>
+        <w:t>Phloiphailin</w:t>
+      </w:r>
+      <w:proofErr w:type="spellEnd"/>
+      <w:r>
+        <w:rPr>
+          <w:rFonts w:ascii="Segoe UI Emoji" w:hAnsi="Segoe UI Emoji" w:cs="Segoe UI Emoji"/>
+          <w:b/>
+          <w:bCs/>
+        </w:rPr>
+        <w:t>]</w:t>
+      </w:r>
+      <w:r>
+        <w:rPr>
+          <w:rFonts w:ascii="Segoe UI Emoji" w:hAnsi="Segoe UI Emoji" w:cs="Segoe UI Emoji"/>
+        </w:rPr>
+        <w:t xml:space="preserve"> "Moving to Chapter 2, Literature Review. When comparing the existing MFU system with our proposed system, the paradigm shift is evident. Currently, external bookings require walk-ins and manual paper </w:t>
+      </w:r>
+      <w:proofErr w:type="gramStart"/>
+      <w:r>
+        <w:rPr>
+          <w:rFonts w:ascii="Segoe UI Emoji" w:hAnsi="Segoe UI Emoji" w:cs="Segoe UI Emoji"/>
+        </w:rPr>
+        <w:t>routing</w:t>
+      </w:r>
+      <w:proofErr w:type="gramEnd"/>
+      <w:r>
+        <w:rPr>
+          <w:rFonts w:ascii="Segoe UI Emoji" w:hAnsi="Segoe UI Emoji" w:cs="Segoe UI Emoji"/>
+        </w:rPr>
+        <w:t xml:space="preserve">. We are replacing this with </w:t>
+      </w:r>
+      <w:r>
+        <w:rPr>
+          <w:rFonts w:ascii="Segoe UI Emoji" w:hAnsi="Segoe UI Emoji" w:cs="Segoe UI Emoji"/>
+          <w:b/>
+          <w:bCs/>
+        </w:rPr>
+        <w:t>Direct Online Booking</w:t>
+      </w:r>
+      <w:r>
+        <w:rPr>
+          <w:rFonts w:ascii="Segoe UI Emoji" w:hAnsi="Segoe UI Emoji" w:cs="Segoe UI Emoji"/>
+        </w:rPr>
+        <w:t xml:space="preserve"> and a </w:t>
+      </w:r>
+      <w:r>
+        <w:rPr>
+          <w:rFonts w:ascii="Segoe UI Emoji" w:hAnsi="Segoe UI Emoji" w:cs="Segoe UI Emoji"/>
+          <w:b/>
+          <w:bCs/>
+        </w:rPr>
+        <w:t>Fully Automated Web-based Workflow</w:t>
+      </w:r>
+      <w:r>
+        <w:rPr>
+          <w:rFonts w:ascii="Segoe UI Emoji" w:hAnsi="Segoe UI Emoji" w:cs="Segoe UI Emoji"/>
+        </w:rPr>
+        <w:t xml:space="preserve">. Instead of handling cash at the counter, users will experience </w:t>
+      </w:r>
+      <w:r>
+        <w:rPr>
+          <w:rFonts w:ascii="Segoe UI Emoji" w:hAnsi="Segoe UI Emoji" w:cs="Segoe UI Emoji"/>
+          <w:b/>
+          <w:bCs/>
+        </w:rPr>
+        <w:t xml:space="preserve">Integrated </w:t>
+      </w:r>
+      <w:proofErr w:type="spellStart"/>
+      <w:r>
+        <w:rPr>
+          <w:rFonts w:ascii="Segoe UI Emoji" w:hAnsi="Segoe UI Emoji" w:cs="Segoe UI Emoji"/>
+          <w:b/>
+          <w:bCs/>
+        </w:rPr>
+        <w:t>PromptPay</w:t>
+      </w:r>
+      <w:proofErr w:type="spellEnd"/>
+      <w:r>
+        <w:rPr>
+          <w:rFonts w:ascii="Segoe UI Emoji" w:hAnsi="Segoe UI Emoji" w:cs="Segoe UI Emoji"/>
+          <w:b/>
+          <w:bCs/>
+        </w:rPr>
+        <w:t xml:space="preserve"> QR transactions</w:t>
+      </w:r>
+      <w:r>
+        <w:rPr>
+          <w:rFonts w:ascii="Segoe UI Emoji" w:hAnsi="Segoe UI Emoji" w:cs="Segoe UI Emoji"/>
+        </w:rPr>
+        <w:t>. Furthermore, requesting service add-ons will no longer require manual paperwork; it will be an automated selection process with instant cost calculation."</w:t>
+      </w:r>
+    </w:p>
+    <w:p>
+      <w:pPr>
+        <w:rPr>
+          <w:rFonts w:ascii="Segoe UI Emoji" w:hAnsi="Segoe UI Emoji" w:cs="Segoe UI Emoji"/>
+        </w:rPr>
+      </w:pPr>
+      <w:r>
+        <w:rPr>
+          <w:rFonts w:ascii="Segoe UI Emoji" w:hAnsi="Segoe UI Emoji" w:cs="Segoe UI Emoji"/>
+          <w:b/>
+          <w:bCs/>
+        </w:rPr>
+        <w:t>☑ Slide 12: LITERATURE REVIEW - COMPETITIVE ANALYSIS</w:t>
+      </w:r>
+      <w:r>
+        <w:rPr>
+          <w:rFonts w:ascii="Segoe UI Emoji" w:hAnsi="Segoe UI Emoji" w:cs="Segoe UI Emoji"/>
+        </w:rPr>
+        <w:t xml:space="preserve"> </w:t>
+      </w:r>
+      <w:r>
+        <w:rPr>
+          <w:rFonts w:ascii="Segoe UI Emoji" w:hAnsi="Segoe UI Emoji" w:cs="Segoe UI Emoji"/>
+          <w:b/>
+          <w:bCs/>
+        </w:rPr>
+        <w:t>[</w:t>
+      </w:r>
+      <w:proofErr w:type="spellStart"/>
+      <w:r>
+        <w:rPr>
+          <w:rFonts w:ascii="Segoe UI Emoji" w:hAnsi="Segoe UI Emoji" w:cs="Segoe UI Emoji"/>
+          <w:b/>
+          <w:bCs/>
+        </w:rPr>
+        <w:t>Phloiphailin</w:t>
+      </w:r>
+      <w:proofErr w:type="spellEnd"/>
+      <w:r>
+        <w:rPr>
+          <w:rFonts w:ascii="Segoe UI Emoji" w:hAnsi="Segoe UI Emoji" w:cs="Segoe UI Emoji"/>
+          <w:b/>
+          <w:bCs/>
+        </w:rPr>
+        <w:t>]</w:t>
+      </w:r>
+      <w:r>
+        <w:rPr>
+          <w:rFonts w:ascii="Segoe UI Emoji" w:hAnsi="Segoe UI Emoji" w:cs="Segoe UI Emoji"/>
+        </w:rPr>
+        <w:t xml:space="preserve"> "We also conducted a competitive analysis against commercial platforms like </w:t>
+      </w:r>
+      <w:proofErr w:type="spellStart"/>
+      <w:r>
+        <w:rPr>
+          <w:rFonts w:ascii="Segoe UI Emoji" w:hAnsi="Segoe UI Emoji" w:cs="Segoe UI Emoji"/>
+        </w:rPr>
+        <w:t>Peerspace</w:t>
+      </w:r>
+      <w:proofErr w:type="spellEnd"/>
+      <w:r>
+        <w:rPr>
+          <w:rFonts w:ascii="Segoe UI Emoji" w:hAnsi="Segoe UI Emoji" w:cs="Segoe UI Emoji"/>
+        </w:rPr>
+        <w:t xml:space="preserve"> and </w:t>
+      </w:r>
+      <w:proofErr w:type="spellStart"/>
+      <w:r>
+        <w:rPr>
+          <w:rFonts w:ascii="Segoe UI Emoji" w:hAnsi="Segoe UI Emoji" w:cs="Segoe UI Emoji"/>
+        </w:rPr>
+        <w:t>Skedda</w:t>
+      </w:r>
+      <w:proofErr w:type="spellEnd"/>
+      <w:r>
+        <w:rPr>
+          <w:rFonts w:ascii="Segoe UI Emoji" w:hAnsi="Segoe UI Emoji" w:cs="Segoe UI Emoji"/>
+        </w:rPr>
+        <w:t xml:space="preserve">. While those platforms are excellent for general commercial event spaces, they are rigid. Our proposed system is </w:t>
+      </w:r>
+      <w:r>
+        <w:rPr>
+          <w:rFonts w:ascii="Segoe UI Emoji" w:hAnsi="Segoe UI Emoji" w:cs="Segoe UI Emoji"/>
+          <w:b/>
+          <w:bCs/>
+        </w:rPr>
+        <w:t xml:space="preserve">tailor-made specifically for university </w:t>
+      </w:r>
+      <w:r>
+        <w:rPr>
+          <w:rFonts w:ascii="Segoe UI Emoji" w:hAnsi="Segoe UI Emoji" w:cs="Segoe UI Emoji"/>
+          <w:b/>
+          <w:bCs/>
+        </w:rPr>
+        <w:lastRenderedPageBreak/>
+        <w:t>operations</w:t>
+      </w:r>
+      <w:r>
+        <w:rPr>
+          <w:rFonts w:ascii="Segoe UI Emoji" w:hAnsi="Segoe UI Emoji" w:cs="Segoe UI Emoji"/>
+        </w:rPr>
+        <w:t>. It features dynamic role-based pricing and a specialized Executive Approval Workflow that standard platforms simply do not accommodate."</w:t>
+      </w:r>
+    </w:p>
+    <w:p>
+      <w:pPr>
+        <w:rPr>
+          <w:rFonts w:ascii="Segoe UI Emoji" w:hAnsi="Segoe UI Emoji" w:cs="Segoe UI Emoji"/>
+        </w:rPr>
+      </w:pPr>
+      <w:r>
+        <w:rPr>
+          <w:rFonts w:ascii="Segoe UI Emoji" w:hAnsi="Segoe UI Emoji" w:cs="Segoe UI Emoji"/>
+          <w:b/>
+          <w:bCs/>
+        </w:rPr>
+        <w:t>☑ Slide 13: LITERATURE REVIEW - CORE TECHNOLOGIES</w:t>
+      </w:r>
+      <w:r>
+        <w:rPr>
+          <w:rFonts w:ascii="Segoe UI Emoji" w:hAnsi="Segoe UI Emoji" w:cs="Segoe UI Emoji"/>
+        </w:rPr>
+        <w:t xml:space="preserve"> </w:t>
+      </w:r>
+      <w:r>
+        <w:rPr>
+          <w:rFonts w:ascii="Segoe UI Emoji" w:hAnsi="Segoe UI Emoji" w:cs="Segoe UI Emoji"/>
+          <w:b/>
+          <w:bCs/>
+        </w:rPr>
+        <w:t>[</w:t>
+      </w:r>
+      <w:proofErr w:type="spellStart"/>
+      <w:r>
+        <w:rPr>
+          <w:rFonts w:ascii="Segoe UI Emoji" w:hAnsi="Segoe UI Emoji" w:cs="Segoe UI Emoji"/>
+          <w:b/>
+          <w:bCs/>
+        </w:rPr>
+        <w:t>Prathanakorn</w:t>
+      </w:r>
+      <w:proofErr w:type="spellEnd"/>
+      <w:r>
+        <w:rPr>
+          <w:rFonts w:ascii="Segoe UI Emoji" w:hAnsi="Segoe UI Emoji" w:cs="Segoe UI Emoji"/>
+          <w:b/>
+          <w:bCs/>
+        </w:rPr>
+        <w:t>]</w:t>
+      </w:r>
+      <w:r>
+        <w:rPr>
+          <w:rFonts w:ascii="Segoe UI Emoji" w:hAnsi="Segoe UI Emoji" w:cs="Segoe UI Emoji"/>
+        </w:rPr>
+        <w:t xml:space="preserve"> "Regarding the Core Technologies chosen for this project: For the </w:t>
+      </w:r>
+      <w:r>
+        <w:rPr>
+          <w:rFonts w:ascii="Segoe UI Emoji" w:hAnsi="Segoe UI Emoji" w:cs="Segoe UI Emoji"/>
+          <w:b/>
+          <w:bCs/>
+        </w:rPr>
+        <w:t>Frontend</w:t>
+      </w:r>
+      <w:r>
+        <w:rPr>
+          <w:rFonts w:ascii="Segoe UI Emoji" w:hAnsi="Segoe UI Emoji" w:cs="Segoe UI Emoji"/>
+        </w:rPr>
+        <w:t xml:space="preserve">, we are utilizing </w:t>
+      </w:r>
+      <w:r>
+        <w:rPr>
+          <w:rFonts w:ascii="Segoe UI Emoji" w:hAnsi="Segoe UI Emoji" w:cs="Segoe UI Emoji"/>
+          <w:b/>
+          <w:bCs/>
+        </w:rPr>
+        <w:t>Vue.js</w:t>
+      </w:r>
+      <w:r>
+        <w:rPr>
+          <w:rFonts w:ascii="Segoe UI Emoji" w:hAnsi="Segoe UI Emoji" w:cs="Segoe UI Emoji"/>
+        </w:rPr>
+        <w:t xml:space="preserve"> and </w:t>
+      </w:r>
+      <w:r>
+        <w:rPr>
+          <w:rFonts w:ascii="Segoe UI Emoji" w:hAnsi="Segoe UI Emoji" w:cs="Segoe UI Emoji"/>
+          <w:b/>
+          <w:bCs/>
+        </w:rPr>
+        <w:t>Tailwind CSS</w:t>
+      </w:r>
+      <w:r>
+        <w:rPr>
+          <w:rFonts w:ascii="Segoe UI Emoji" w:hAnsi="Segoe UI Emoji" w:cs="Segoe UI Emoji"/>
+        </w:rPr>
+        <w:t xml:space="preserve">. This combination allows us to build a highly responsive, Single Page Application (SPA) that delivers </w:t>
+      </w:r>
+      <w:proofErr w:type="gramStart"/>
+      <w:r>
+        <w:rPr>
+          <w:rFonts w:ascii="Segoe UI Emoji" w:hAnsi="Segoe UI Emoji" w:cs="Segoe UI Emoji"/>
+        </w:rPr>
+        <w:t>a smooth</w:t>
+      </w:r>
+      <w:proofErr w:type="gramEnd"/>
+      <w:r>
+        <w:rPr>
+          <w:rFonts w:ascii="Segoe UI Emoji" w:hAnsi="Segoe UI Emoji" w:cs="Segoe UI Emoji"/>
+        </w:rPr>
+        <w:t xml:space="preserve"> user experience across all devices. For the </w:t>
+      </w:r>
+      <w:r>
+        <w:rPr>
+          <w:rFonts w:ascii="Segoe UI Emoji" w:hAnsi="Segoe UI Emoji" w:cs="Segoe UI Emoji"/>
+          <w:b/>
+          <w:bCs/>
+        </w:rPr>
+        <w:t>Backend</w:t>
+      </w:r>
+      <w:r>
+        <w:rPr>
+          <w:rFonts w:ascii="Segoe UI Emoji" w:hAnsi="Segoe UI Emoji" w:cs="Segoe UI Emoji"/>
+        </w:rPr>
+        <w:t xml:space="preserve">, the server logic and API endpoints are handled by </w:t>
+      </w:r>
+      <w:r>
+        <w:rPr>
+          <w:rFonts w:ascii="Segoe UI Emoji" w:hAnsi="Segoe UI Emoji" w:cs="Segoe UI Emoji"/>
+          <w:b/>
+          <w:bCs/>
+        </w:rPr>
+        <w:t>Node.js</w:t>
+      </w:r>
+      <w:r>
+        <w:rPr>
+          <w:rFonts w:ascii="Segoe UI Emoji" w:hAnsi="Segoe UI Emoji" w:cs="Segoe UI Emoji"/>
+        </w:rPr>
+        <w:t xml:space="preserve">, ensuring fast asynchronous processing. And for our </w:t>
+      </w:r>
+      <w:r>
+        <w:rPr>
+          <w:rFonts w:ascii="Segoe UI Emoji" w:hAnsi="Segoe UI Emoji" w:cs="Segoe UI Emoji"/>
+          <w:b/>
+          <w:bCs/>
+        </w:rPr>
+        <w:t>Database</w:t>
+      </w:r>
+      <w:r>
+        <w:rPr>
+          <w:rFonts w:ascii="Segoe UI Emoji" w:hAnsi="Segoe UI Emoji" w:cs="Segoe UI Emoji"/>
+        </w:rPr>
+        <w:t xml:space="preserve">, we rely on </w:t>
+      </w:r>
+      <w:r>
+        <w:rPr>
+          <w:rFonts w:ascii="Segoe UI Emoji" w:hAnsi="Segoe UI Emoji" w:cs="Segoe UI Emoji"/>
+          <w:b/>
+          <w:bCs/>
+        </w:rPr>
+        <w:t>PostgreSQL</w:t>
+      </w:r>
+      <w:r>
+        <w:rPr>
+          <w:rFonts w:ascii="Segoe UI Emoji" w:hAnsi="Segoe UI Emoji" w:cs="Segoe UI Emoji"/>
+        </w:rPr>
+        <w:t xml:space="preserve">, managed via </w:t>
+      </w:r>
+      <w:proofErr w:type="spellStart"/>
+      <w:r>
+        <w:rPr>
+          <w:rFonts w:ascii="Segoe UI Emoji" w:hAnsi="Segoe UI Emoji" w:cs="Segoe UI Emoji"/>
+          <w:b/>
+          <w:bCs/>
+        </w:rPr>
+        <w:t>pgAdmin</w:t>
+      </w:r>
+      <w:proofErr w:type="spellEnd"/>
+      <w:r>
+        <w:rPr>
+          <w:rFonts w:ascii="Segoe UI Emoji" w:hAnsi="Segoe UI Emoji" w:cs="Segoe UI Emoji"/>
+          <w:b/>
+          <w:bCs/>
+        </w:rPr>
+        <w:t xml:space="preserve"> 4</w:t>
+      </w:r>
+      <w:r>
+        <w:rPr>
+          <w:rFonts w:ascii="Segoe UI Emoji" w:hAnsi="Segoe UI Emoji" w:cs="Segoe UI Emoji"/>
+        </w:rPr>
+        <w:t xml:space="preserve">, to handle complex relational data mapping securely. Now, </w:t>
+      </w:r>
+      <w:proofErr w:type="spellStart"/>
+      <w:r>
+        <w:rPr>
+          <w:rFonts w:ascii="Segoe UI Emoji" w:hAnsi="Segoe UI Emoji" w:cs="Segoe UI Emoji"/>
+        </w:rPr>
+        <w:t>Paniti</w:t>
+      </w:r>
+      <w:proofErr w:type="spellEnd"/>
+      <w:r>
+        <w:rPr>
+          <w:rFonts w:ascii="Segoe UI Emoji" w:hAnsi="Segoe UI Emoji" w:cs="Segoe UI Emoji"/>
+        </w:rPr>
+        <w:t xml:space="preserve"> will take over to dive deep into our System Analysis and Design."</w:t>
+      </w:r>
+    </w:p>
+    <w:p>
+      <w:pPr>
+        <w:rPr>
+          <w:rFonts w:ascii="Segoe UI Emoji" w:hAnsi="Segoe UI Emoji" w:cs="Segoe UI Emoji"/>
+        </w:rPr>
+      </w:pPr>
+      <w:r>
+        <w:rPr>
+          <w:rFonts w:ascii="Segoe UI Emoji" w:hAnsi="Segoe UI Emoji" w:cs="Segoe UI Emoji"/>
+        </w:rPr>
+        <w:pict w14:anchorId="0F559A7C">
+          <v:rect id="_x0000_i1063" style="width:0;height:1.5pt" o:hralign="center" o:hrstd="t" o:hr="t" fillcolor="#a0a0a0" stroked="f"/>
+        </w:pict>
+      </w:r>
+    </w:p>
+    <w:p>
+      <w:pPr>
+        <w:rPr>
+          <w:rFonts w:ascii="Segoe UI Emoji" w:hAnsi="Segoe UI Emoji" w:cs="Segoe UI Emoji"/>
+          <w:b/>
+          <w:bCs/>
+        </w:rPr>
+      </w:pPr>
+      <w:r>
+        <w:rPr>
+          <w:rFonts w:ascii="Segoe UI Emoji" w:hAnsi="Segoe UI Emoji" w:cs="Segoe UI Emoji"/>
+          <w:b/>
+          <w:bCs/>
+        </w:rPr>
+        <w:t>🟢 CHAPTER 3: ANALYSIS AND DESIGN (~10 Minutes)</w:t>
+      </w:r>
+    </w:p>
+    <w:p>
+      <w:pPr>
+        <w:rPr>
+          <w:rFonts w:ascii="Segoe UI Emoji" w:hAnsi="Segoe UI Emoji" w:cs="Segoe UI Emoji"/>
+        </w:rPr>
+      </w:pPr>
+      <w:r>
+        <w:rPr>
+          <w:rFonts w:ascii="Segoe UI Emoji" w:hAnsi="Segoe UI Emoji" w:cs="Segoe UI Emoji"/>
+          <w:i/>
+          <w:iCs/>
+        </w:rPr>
+        <w:t>(Note: Use this time to show Diagrams and UI Prototypes on the screen)</w:t>
+      </w:r>
+    </w:p>
+    <w:p>
+      <w:pPr>
+        <w:rPr>
+          <w:rFonts w:ascii="Segoe UI Emoji" w:hAnsi="Segoe UI Emoji" w:cs="Segoe UI Emoji"/>
+        </w:rPr>
+      </w:pPr>
+      <w:r>
+        <w:rPr>
+          <w:rFonts w:ascii="Segoe UI Emoji" w:hAnsi="Segoe UI Emoji" w:cs="Segoe UI Emoji"/>
+          <w:b/>
+          <w:bCs/>
+        </w:rPr>
+        <w:t>[</w:t>
+      </w:r>
+      <w:proofErr w:type="spellStart"/>
+      <w:r>
+        <w:rPr>
+          <w:rFonts w:ascii="Segoe UI Emoji" w:hAnsi="Segoe UI Emoji" w:cs="Segoe UI Emoji"/>
+          <w:b/>
+          <w:bCs/>
+        </w:rPr>
+        <w:t>Phloiphailin</w:t>
+      </w:r>
+      <w:proofErr w:type="spellEnd"/>
+      <w:r>
+        <w:rPr>
+          <w:rFonts w:ascii="Segoe UI Emoji" w:hAnsi="Segoe UI Emoji" w:cs="Segoe UI Emoji"/>
+          <w:b/>
+          <w:bCs/>
+        </w:rPr>
+        <w:t>]</w:t>
+      </w:r>
+      <w:r>
+        <w:rPr>
+          <w:rFonts w:ascii="Segoe UI Emoji" w:hAnsi="Segoe UI Emoji" w:cs="Segoe UI Emoji"/>
+        </w:rPr>
+        <w:t xml:space="preserve"> </w:t>
+      </w:r>
+      <w:r>
+        <w:rPr>
+          <w:rFonts w:ascii="Segoe UI Emoji" w:hAnsi="Segoe UI Emoji" w:cs="Segoe UI Emoji"/>
+        </w:rPr>
+        <w:t>(Presentation use case diagram)</w:t>
+      </w:r>
+    </w:p>
+    <w:p>
+      <w:pPr>
+        <w:rPr>
+          <w:rFonts w:ascii="Segoe UI Emoji" w:hAnsi="Segoe UI Emoji" w:cs="Segoe UI Emoji"/>
+        </w:rPr>
+      </w:pPr>
+      <w:r>
+        <w:rPr>
+          <w:rFonts w:ascii="Segoe UI Emoji" w:hAnsi="Segoe UI Emoji" w:cs="Segoe UI Emoji"/>
+          <w:b/>
+          <w:bCs/>
+        </w:rPr>
+        <w:t>[</w:t>
+      </w:r>
+      <w:proofErr w:type="spellStart"/>
+      <w:r>
+        <w:rPr>
+          <w:rFonts w:ascii="Segoe UI Emoji" w:hAnsi="Segoe UI Emoji" w:cs="Segoe UI Emoji"/>
+          <w:b/>
+          <w:bCs/>
+        </w:rPr>
+        <w:t>P</w:t>
+      </w:r>
+      <w:r>
+        <w:rPr>
+          <w:rFonts w:ascii="Segoe UI Emoji" w:hAnsi="Segoe UI Emoji" w:cs="Segoe UI Emoji"/>
+          <w:b/>
+          <w:bCs/>
+        </w:rPr>
+        <w:t>rathanakorn</w:t>
+      </w:r>
+      <w:proofErr w:type="spellEnd"/>
+      <w:r>
+        <w:rPr>
+          <w:rFonts w:ascii="Segoe UI Emoji" w:hAnsi="Segoe UI Emoji" w:cs="Segoe UI Emoji"/>
+          <w:b/>
+          <w:bCs/>
+        </w:rPr>
+        <w:t>]</w:t>
+      </w:r>
+      <w:r>
+        <w:rPr>
+          <w:rFonts w:ascii="Segoe UI Emoji" w:hAnsi="Segoe UI Emoji" w:cs="Segoe UI Emoji"/>
+        </w:rPr>
+        <w:t xml:space="preserve"> (Presentation Swim Lane diagram)</w:t>
+      </w:r>
+    </w:p>
+    <w:p>
+      <w:pPr>
+        <w:rPr>
+          <w:rFonts w:ascii="Segoe UI Emoji" w:hAnsi="Segoe UI Emoji" w:cs="Segoe UI Emoji"/>
+        </w:rPr>
+      </w:pPr>
+      <w:r>
+        <w:rPr>
+          <w:rFonts w:ascii="Segoe UI Emoji" w:hAnsi="Segoe UI Emoji" w:cs="Segoe UI Emoji"/>
+          <w:b/>
+          <w:bCs/>
+        </w:rPr>
+        <w:t>[</w:t>
+      </w:r>
+      <w:proofErr w:type="spellStart"/>
+      <w:r>
+        <w:rPr>
+          <w:rFonts w:ascii="Segoe UI Emoji" w:hAnsi="Segoe UI Emoji" w:cs="Segoe UI Emoji"/>
+          <w:b/>
+          <w:bCs/>
+        </w:rPr>
+        <w:t>P</w:t>
+      </w:r>
+      <w:r>
+        <w:rPr>
+          <w:rFonts w:ascii="Segoe UI Emoji" w:hAnsi="Segoe UI Emoji" w:cs="Segoe UI Emoji"/>
+          <w:b/>
+          <w:bCs/>
+        </w:rPr>
+        <w:t>aniti</w:t>
+      </w:r>
+      <w:proofErr w:type="spellEnd"/>
+      <w:r>
+        <w:rPr>
+          <w:rFonts w:ascii="Segoe UI Emoji" w:hAnsi="Segoe UI Emoji" w:cs="Segoe UI Emoji"/>
+          <w:b/>
+          <w:bCs/>
+        </w:rPr>
+        <w:t>]</w:t>
+      </w:r>
+      <w:r>
+        <w:rPr>
+          <w:rFonts w:ascii="Segoe UI Emoji" w:hAnsi="Segoe UI Emoji" w:cs="Segoe UI Emoji"/>
+        </w:rPr>
+        <w:t xml:space="preserve"> "let's explore our </w:t>
+      </w:r>
+      <w:r>
+        <w:rPr>
+          <w:rFonts w:ascii="Segoe UI Emoji" w:hAnsi="Segoe UI Emoji" w:cs="Segoe UI Emoji"/>
+          <w:b/>
+          <w:bCs/>
+        </w:rPr>
+        <w:t>User Interface (UI) Design</w:t>
+      </w:r>
+      <w:r>
+        <w:rPr>
+          <w:rFonts w:ascii="Segoe UI Emoji" w:hAnsi="Segoe UI Emoji" w:cs="Segoe UI Emoji"/>
+        </w:rPr>
+        <w:t xml:space="preserve">." </w:t>
+      </w:r>
+      <w:r>
+        <w:rPr>
+          <w:rFonts w:ascii="Segoe UI Emoji" w:hAnsi="Segoe UI Emoji" w:cs="Segoe UI Emoji"/>
+          <w:i/>
+          <w:iCs/>
+        </w:rPr>
+        <w:t>(Show UI Prototypes or Live Demo)</w:t>
+      </w:r>
+      <w:r>
+        <w:rPr>
+          <w:rFonts w:ascii="Segoe UI Emoji" w:hAnsi="Segoe UI Emoji" w:cs="Segoe UI Emoji"/>
+        </w:rPr>
+        <w:t xml:space="preserve"> "We designed the platform adhering strictly to MFU's corporate identity, utilizing deep red and gold tones.</w:t>
+      </w:r>
+    </w:p>
+    <w:p>
+      <w:pPr>
         <w:numPr>
           <w:ilvl w:val="0"/>
-          <w:numId w:val="2"/>
+          <w:numId w:val="10"/>
         </w:numPr>
-      </w:pPr>
-      <w:r>
-        <w:t>"Right now, booking rooms and spaces at MFU still involves a lot of paperwork. Because of this manual process, mistakes happen easily, like double-booking a room or delays in communication."</w:t>
+        <w:rPr>
+          <w:rFonts w:ascii="Segoe UI Emoji" w:hAnsi="Segoe UI Emoji" w:cs="Segoe UI Emoji"/>
+        </w:rPr>
+      </w:pPr>
+      <w:r>
+        <w:rPr>
+          <w:rFonts w:ascii="Segoe UI Emoji" w:hAnsi="Segoe UI Emoji" w:cs="Segoe UI Emoji"/>
+          <w:b/>
+          <w:bCs/>
+        </w:rPr>
+        <w:t>For the User Home Page</w:t>
+      </w:r>
+      <w:r>
+        <w:rPr>
+          <w:rFonts w:ascii="Segoe UI Emoji" w:hAnsi="Segoe UI Emoji" w:cs="Segoe UI Emoji"/>
+        </w:rPr>
+        <w:t>, we focus on a clean search bar and promotional banners. The room catalog displays clear 'Available' or 'Booked' badges.</w:t>
       </w:r>
     </w:p>
     <w:p>
       <w:pPr>
         <w:numPr>
           <w:ilvl w:val="0"/>
-          <w:numId w:val="2"/>
+          <w:numId w:val="10"/>
         </w:numPr>
-      </w:pPr>
-      <w:r>
-        <w:t xml:space="preserve">"To fix this, we are moving everything to a modern web application. Our main goal is to stop scheduling conflicts completely and make it super easy to track payments and approvals. Now, I'll pass it to </w:t>
-      </w:r>
-      <w:proofErr w:type="spellStart"/>
-      <w:r>
-        <w:t>Prathanakorn</w:t>
-      </w:r>
-      <w:proofErr w:type="spellEnd"/>
-      <w:r>
-        <w:t xml:space="preserve"> to talk about our objectives."</w:t>
+        <w:rPr>
+          <w:rFonts w:ascii="Segoe UI Emoji" w:hAnsi="Segoe UI Emoji" w:cs="Segoe UI Emoji"/>
+        </w:rPr>
+      </w:pPr>
+      <w:r>
+        <w:rPr>
+          <w:rFonts w:ascii="Segoe UI Emoji" w:hAnsi="Segoe UI Emoji" w:cs="Segoe UI Emoji"/>
+          <w:b/>
+          <w:bCs/>
+        </w:rPr>
+        <w:t>In the Booking Interface</w:t>
+      </w:r>
+      <w:r>
+        <w:rPr>
+          <w:rFonts w:ascii="Segoe UI Emoji" w:hAnsi="Segoe UI Emoji" w:cs="Segoe UI Emoji"/>
+        </w:rPr>
+        <w:t>, users experience a step-by-step form. When they select their user type and add-ons, the right-side panel dynamically calculates the subtotal, applies promo code discounts, and displays the final net price instantly.</w:t>
       </w:r>
     </w:p>
     <w:p>
-      <w:r>
-        <w:rPr>
-          <w:b/>
-          <w:bCs/>
-        </w:rPr>
-        <w:t>[Slide 4: Project Objectives]</w:t>
+      <w:pPr>
+        <w:numPr>
+          <w:ilvl w:val="0"/>
+          <w:numId w:val="10"/>
+        </w:numPr>
+        <w:rPr>
+          <w:rFonts w:ascii="Segoe UI Emoji" w:hAnsi="Segoe UI Emoji" w:cs="Segoe UI Emoji"/>
+        </w:rPr>
+      </w:pPr>
+      <w:r>
+        <w:rPr>
+          <w:rFonts w:ascii="Segoe UI Emoji" w:hAnsi="Segoe UI Emoji" w:cs="Segoe UI Emoji"/>
+          <w:b/>
+          <w:bCs/>
+        </w:rPr>
+        <w:t>For the Admin Dashboard</w:t>
+      </w:r>
+      <w:r>
+        <w:rPr>
+          <w:rFonts w:ascii="Segoe UI Emoji" w:hAnsi="Segoe UI Emoji" w:cs="Segoe UI Emoji"/>
+        </w:rPr>
+        <w:t>, upon logging in, admins are greeted with data visualization charts summarizing monthly revenue and room utilization rates. The reservation management tab allows admins to quickly approve requests, attach PDF documents, and view post-service feedback from users. This design guarantees an intuitive experience while minimizing human error."</w:t>
       </w:r>
     </w:p>
     <w:p>
-      <w:r>
-        <w:rPr>
-          <w:b/>
-          <w:bCs/>
-        </w:rPr>
-        <w:t xml:space="preserve">(Presenter 2: </w:t>
+      <w:pPr>
+        <w:ind w:left="360"/>
+        <w:rPr>
+          <w:rFonts w:ascii="Segoe UI Emoji" w:hAnsi="Segoe UI Emoji" w:cs="Segoe UI Emoji"/>
+        </w:rPr>
+      </w:pPr>
+      <w:r>
+        <w:rPr>
+          <w:rFonts w:ascii="Segoe UI Emoji" w:hAnsi="Segoe UI Emoji" w:cs="Segoe UI Emoji"/>
+          <w:b/>
+          <w:bCs/>
+        </w:rPr>
+        <w:t>[</w:t>
       </w:r>
       <w:proofErr w:type="spellStart"/>
       <w:r>
         <w:rPr>
-          <w:b/>
-          <w:bCs/>
-        </w:rPr>
-        <w:t>Prathanakorn</w:t>
+          <w:rFonts w:ascii="Segoe UI Emoji" w:hAnsi="Segoe UI Emoji" w:cs="Segoe UI Emoji"/>
+          <w:b/>
+          <w:bCs/>
+        </w:rPr>
+        <w:t>Paniti</w:t>
       </w:r>
       <w:proofErr w:type="spellEnd"/>
       <w:r>
         <w:rPr>
-          <w:b/>
-          <w:bCs/>
-        </w:rPr>
-        <w:t>)</w:t>
+          <w:rFonts w:ascii="Segoe UI Emoji" w:hAnsi="Segoe UI Emoji" w:cs="Segoe UI Emoji"/>
+          <w:b/>
+          <w:bCs/>
+        </w:rPr>
+        <w:t>]</w:t>
+      </w:r>
+      <w:r>
+        <w:rPr>
+          <w:rFonts w:ascii="Segoe UI Emoji" w:hAnsi="Segoe UI Emoji" w:cs="Segoe UI Emoji"/>
+        </w:rPr>
+        <w:t xml:space="preserve"> "Moving on to our </w:t>
+      </w:r>
+      <w:r>
+        <w:rPr>
+          <w:rFonts w:ascii="Segoe UI Emoji" w:hAnsi="Segoe UI Emoji" w:cs="Segoe UI Emoji"/>
+          <w:b/>
+          <w:bCs/>
+        </w:rPr>
+        <w:t>Database Design</w:t>
+      </w:r>
+      <w:r>
+        <w:rPr>
+          <w:rFonts w:ascii="Segoe UI Emoji" w:hAnsi="Segoe UI Emoji" w:cs="Segoe UI Emoji"/>
+        </w:rPr>
+        <w:t xml:space="preserve">." </w:t>
+      </w:r>
+      <w:r>
+        <w:rPr>
+          <w:rFonts w:ascii="Segoe UI Emoji" w:hAnsi="Segoe UI Emoji" w:cs="Segoe UI Emoji"/>
+          <w:i/>
+          <w:iCs/>
+        </w:rPr>
+        <w:t>(Show ER Diagram)</w:t>
+      </w:r>
+      <w:r>
+        <w:rPr>
+          <w:rFonts w:ascii="Segoe UI Emoji" w:hAnsi="Segoe UI Emoji" w:cs="Segoe UI Emoji"/>
+        </w:rPr>
+        <w:t xml:space="preserve"> "Our ER-Diagram is highly normalized to support scalability. For instance, the rooms and </w:t>
+      </w:r>
+      <w:proofErr w:type="spellStart"/>
+      <w:r>
+        <w:rPr>
+          <w:rFonts w:ascii="Segoe UI Emoji" w:hAnsi="Segoe UI Emoji" w:cs="Segoe UI Emoji"/>
+        </w:rPr>
+        <w:t>room_pricing</w:t>
+      </w:r>
+      <w:proofErr w:type="spellEnd"/>
+      <w:r>
+        <w:rPr>
+          <w:rFonts w:ascii="Segoe UI Emoji" w:hAnsi="Segoe UI Emoji" w:cs="Segoe UI Emoji"/>
+        </w:rPr>
+        <w:t xml:space="preserve"> tables are separated using a One-to-Many relationship. This allows a single room to hold multiple dynamic prices based on user roles and durations (Half-day or </w:t>
+      </w:r>
+      <w:proofErr w:type="gramStart"/>
+      <w:r>
+        <w:rPr>
+          <w:rFonts w:ascii="Segoe UI Emoji" w:hAnsi="Segoe UI Emoji" w:cs="Segoe UI Emoji"/>
+        </w:rPr>
+        <w:t>Full-day</w:t>
+      </w:r>
+      <w:proofErr w:type="gramEnd"/>
+      <w:r>
+        <w:rPr>
+          <w:rFonts w:ascii="Segoe UI Emoji" w:hAnsi="Segoe UI Emoji" w:cs="Segoe UI Emoji"/>
+        </w:rPr>
+        <w:t xml:space="preserve">). Another crucial component is the </w:t>
+      </w:r>
+      <w:proofErr w:type="spellStart"/>
+      <w:r>
+        <w:rPr>
+          <w:rFonts w:ascii="Segoe UI Emoji" w:hAnsi="Segoe UI Emoji" w:cs="Segoe UI Emoji"/>
+        </w:rPr>
+        <w:t>admin_activity_logs</w:t>
+      </w:r>
+      <w:proofErr w:type="spellEnd"/>
+      <w:r>
+        <w:rPr>
+          <w:rFonts w:ascii="Segoe UI Emoji" w:hAnsi="Segoe UI Emoji" w:cs="Segoe UI Emoji"/>
+        </w:rPr>
+        <w:t xml:space="preserve"> table. To ensure security and accountability, this table records every single action an admin takes, storing the IP address and the exact JSON data before and after the modification."</w:t>
       </w:r>
     </w:p>
     <w:p>
       <w:pPr>
-        <w:numPr>
-          <w:ilvl w:val="0"/>
-          <w:numId w:val="3"/>
-        </w:numPr>
-      </w:pPr>
-      <w:r>
-        <w:t xml:space="preserve">"Thanks, </w:t>
+        <w:rPr>
+          <w:rFonts w:ascii="Segoe UI Emoji" w:hAnsi="Segoe UI Emoji" w:cs="Segoe UI Emoji"/>
+        </w:rPr>
+      </w:pPr>
+      <w:r>
+        <w:rPr>
+          <w:rFonts w:ascii="Segoe UI Emoji" w:hAnsi="Segoe UI Emoji" w:cs="Segoe UI Emoji"/>
+          <w:b/>
+          <w:bCs/>
+        </w:rPr>
+        <w:lastRenderedPageBreak/>
+        <w:t>[</w:t>
       </w:r>
       <w:proofErr w:type="spellStart"/>
       <w:r>
-        <w:t>Paniti</w:t>
+        <w:rPr>
+          <w:rFonts w:ascii="Segoe UI Emoji" w:hAnsi="Segoe UI Emoji" w:cs="Segoe UI Emoji"/>
+          <w:b/>
+          <w:bCs/>
+        </w:rPr>
+        <w:t>P</w:t>
+      </w:r>
+      <w:r>
+        <w:rPr>
+          <w:rFonts w:ascii="Segoe UI Emoji" w:hAnsi="Segoe UI Emoji" w:cs="Segoe UI Emoji"/>
+          <w:b/>
+          <w:bCs/>
+        </w:rPr>
+        <w:t>hongsapak</w:t>
       </w:r>
       <w:proofErr w:type="spellEnd"/>
       <w:r>
-        <w:t>! For our project objectives, we want to build a fully working web-based room reservation system. We want users to easily check if a room is free and book it online. We also want to give admins the best tools to manage these bookings."</w:t>
+        <w:rPr>
+          <w:rFonts w:ascii="Segoe UI Emoji" w:hAnsi="Segoe UI Emoji" w:cs="Segoe UI Emoji"/>
+          <w:b/>
+          <w:bCs/>
+        </w:rPr>
+        <w:t>]</w:t>
+      </w:r>
+      <w:r>
+        <w:rPr>
+          <w:rFonts w:ascii="Segoe UI Emoji" w:hAnsi="Segoe UI Emoji" w:cs="Segoe UI Emoji"/>
+        </w:rPr>
+        <w:t xml:space="preserve"> (Presentation </w:t>
+      </w:r>
+      <w:r>
+        <w:rPr>
+          <w:rFonts w:ascii="Segoe UI Emoji" w:hAnsi="Segoe UI Emoji" w:cs="Segoe UI Emoji"/>
+        </w:rPr>
+        <w:t>Data dictionary</w:t>
+      </w:r>
+      <w:r>
+        <w:rPr>
+          <w:rFonts w:ascii="Segoe UI Emoji" w:hAnsi="Segoe UI Emoji" w:cs="Segoe UI Emoji"/>
+        </w:rPr>
+        <w:t>)</w:t>
       </w:r>
     </w:p>
     <w:p>
       <w:pPr>
-        <w:numPr>
-          <w:ilvl w:val="0"/>
-          <w:numId w:val="3"/>
-        </w:numPr>
-      </w:pPr>
-      <w:r>
-        <w:t>"To do this, we're building a Full-stack system so the front-end and back-end work perfectly together."</w:t>
+        <w:rPr>
+          <w:rFonts w:ascii="Segoe UI Emoji" w:hAnsi="Segoe UI Emoji" w:cs="Segoe UI Emoji"/>
+        </w:rPr>
+      </w:pPr>
+      <w:r>
+        <w:rPr>
+          <w:rFonts w:ascii="Segoe UI Emoji" w:hAnsi="Segoe UI Emoji" w:cs="Segoe UI Emoji"/>
+        </w:rPr>
+        <w:pict w14:anchorId="62143C2B">
+          <v:rect id="_x0000_i1064" style="width:0;height:1.5pt" o:hralign="center" o:hrstd="t" o:hr="t" fillcolor="#a0a0a0" stroked="f"/>
+        </w:pict>
       </w:r>
     </w:p>
     <w:p>
-      <w:r>
-        <w:rPr>
-          <w:b/>
-          <w:bCs/>
-        </w:rPr>
-        <w:t>[Slide 5-7: Scope of Work - User Roles]</w:t>
+      <w:pPr>
+        <w:rPr>
+          <w:rFonts w:ascii="Segoe UI Emoji" w:hAnsi="Segoe UI Emoji" w:cs="Segoe UI Emoji"/>
+          <w:b/>
+          <w:bCs/>
+        </w:rPr>
+      </w:pPr>
+      <w:r>
+        <w:rPr>
+          <w:rFonts w:ascii="Segoe UI Emoji" w:hAnsi="Segoe UI Emoji" w:cs="Segoe UI Emoji"/>
+          <w:b/>
+          <w:bCs/>
+        </w:rPr>
+        <w:t>🟢 CHAPTER 4: PROJECT PROGRESS AND CONCLUSION (~2 Minutes)</w:t>
       </w:r>
     </w:p>
     <w:p>
-      <w:r>
-        <w:rPr>
-          <w:b/>
-          <w:bCs/>
-        </w:rPr>
-        <w:t xml:space="preserve">(Presenter 2: </w:t>
+      <w:pPr>
+        <w:rPr>
+          <w:rFonts w:ascii="Segoe UI Emoji" w:hAnsi="Segoe UI Emoji" w:cs="Segoe UI Emoji"/>
+        </w:rPr>
+      </w:pPr>
+      <w:r>
+        <w:rPr>
+          <w:rFonts w:ascii="Segoe UI Emoji" w:hAnsi="Segoe UI Emoji" w:cs="Segoe UI Emoji"/>
+          <w:b/>
+          <w:bCs/>
+        </w:rPr>
+        <w:t>☑ Slide 14 &amp; 15: TIMELINE &amp; RESOURCES</w:t>
+      </w:r>
+      <w:r>
+        <w:rPr>
+          <w:rFonts w:ascii="Segoe UI Emoji" w:hAnsi="Segoe UI Emoji" w:cs="Segoe UI Emoji"/>
+        </w:rPr>
+        <w:t xml:space="preserve"> </w:t>
+      </w:r>
+      <w:r>
+        <w:rPr>
+          <w:rFonts w:ascii="Segoe UI Emoji" w:hAnsi="Segoe UI Emoji" w:cs="Segoe UI Emoji"/>
+          <w:b/>
+          <w:bCs/>
+        </w:rPr>
+        <w:t>[</w:t>
       </w:r>
       <w:proofErr w:type="spellStart"/>
       <w:r>
         <w:rPr>
-          <w:b/>
-          <w:bCs/>
-        </w:rPr>
-        <w:t>Prathanakorn</w:t>
+          <w:rFonts w:ascii="Segoe UI Emoji" w:hAnsi="Segoe UI Emoji" w:cs="Segoe UI Emoji"/>
+          <w:b/>
+          <w:bCs/>
+        </w:rPr>
+        <w:t>Paniti</w:t>
       </w:r>
       <w:proofErr w:type="spellEnd"/>
       <w:r>
         <w:rPr>
-          <w:b/>
-          <w:bCs/>
-        </w:rPr>
-        <w:t>)</w:t>
+          <w:rFonts w:ascii="Segoe UI Emoji" w:hAnsi="Segoe UI Emoji" w:cs="Segoe UI Emoji"/>
+          <w:b/>
+          <w:bCs/>
+        </w:rPr>
+        <w:t>]</w:t>
+      </w:r>
+      <w:r>
+        <w:rPr>
+          <w:rFonts w:ascii="Segoe UI Emoji" w:hAnsi="Segoe UI Emoji" w:cs="Segoe UI Emoji"/>
+        </w:rPr>
+        <w:t xml:space="preserve"> "Bringing us to Chapter 4: Project Progress and Future Work. Looking at our timeline, during this past term (January to May), our team has successfully completed Phase 1 and Phase </w:t>
+      </w:r>
+      <w:proofErr w:type="gramStart"/>
+      <w:r>
+        <w:rPr>
+          <w:rFonts w:ascii="Segoe UI Emoji" w:hAnsi="Segoe UI Emoji" w:cs="Segoe UI Emoji"/>
+        </w:rPr>
+        <w:t>2.This</w:t>
+      </w:r>
+      <w:proofErr w:type="gramEnd"/>
+      <w:r>
+        <w:rPr>
+          <w:rFonts w:ascii="Segoe UI Emoji" w:hAnsi="Segoe UI Emoji" w:cs="Segoe UI Emoji"/>
+        </w:rPr>
+        <w:t xml:space="preserve"> includes comprehensive requirement analysis, system architecture design, database modeling, and the development of the functional UI prototype you just saw. </w:t>
+      </w:r>
+      <w:r>
+        <w:rPr>
+          <w:rFonts w:ascii="Segoe UI Emoji" w:hAnsi="Segoe UI Emoji" w:cs="Segoe UI Emoji"/>
+        </w:rPr>
+        <w:t xml:space="preserve">(15) </w:t>
+      </w:r>
+      <w:r>
+        <w:rPr>
+          <w:rFonts w:ascii="Segoe UI Emoji" w:hAnsi="Segoe UI Emoji" w:cs="Segoe UI Emoji"/>
+        </w:rPr>
+        <w:t>For our resources, moving forward, we will utilize actual room inventory datasets provided by the Property Management Division to populate our database."</w:t>
       </w:r>
     </w:p>
     <w:p>
       <w:pPr>
-        <w:numPr>
-          <w:ilvl w:val="0"/>
-          <w:numId w:val="4"/>
-        </w:numPr>
-      </w:pPr>
-      <w:r>
-        <w:t>"So, what can users do? They can search for rooms in real-time, book in advance, and add extras like tables or chairs, with the system calculating the cost automatically. They can also pay safely online."</w:t>
+        <w:rPr>
+          <w:rFonts w:ascii="Segoe UI Emoji" w:hAnsi="Segoe UI Emoji" w:cs="Segoe UI Emoji"/>
+        </w:rPr>
+      </w:pPr>
+      <w:r>
+        <w:rPr>
+          <w:rFonts w:ascii="Segoe UI Emoji" w:hAnsi="Segoe UI Emoji" w:cs="Segoe UI Emoji"/>
+          <w:b/>
+          <w:bCs/>
+        </w:rPr>
+        <w:t>☑ Slide 16 &amp; 17: EXPECTED RESULTS &amp; CONCLUSION</w:t>
+      </w:r>
+      <w:r>
+        <w:rPr>
+          <w:rFonts w:ascii="Segoe UI Emoji" w:hAnsi="Segoe UI Emoji" w:cs="Segoe UI Emoji"/>
+        </w:rPr>
+        <w:t xml:space="preserve"> </w:t>
+      </w:r>
+      <w:r>
+        <w:rPr>
+          <w:rFonts w:ascii="Segoe UI Emoji" w:hAnsi="Segoe UI Emoji" w:cs="Segoe UI Emoji"/>
+          <w:b/>
+          <w:bCs/>
+        </w:rPr>
+        <w:t>[</w:t>
+      </w:r>
+      <w:proofErr w:type="spellStart"/>
+      <w:r>
+        <w:rPr>
+          <w:rFonts w:ascii="Segoe UI Emoji" w:hAnsi="Segoe UI Emoji" w:cs="Segoe UI Emoji"/>
+          <w:b/>
+          <w:bCs/>
+        </w:rPr>
+        <w:t>Paniti</w:t>
+      </w:r>
+      <w:proofErr w:type="spellEnd"/>
+      <w:r>
+        <w:rPr>
+          <w:rFonts w:ascii="Segoe UI Emoji" w:hAnsi="Segoe UI Emoji" w:cs="Segoe UI Emoji"/>
+          <w:b/>
+          <w:bCs/>
+        </w:rPr>
+        <w:t>]</w:t>
+      </w:r>
+      <w:r>
+        <w:rPr>
+          <w:rFonts w:ascii="Segoe UI Emoji" w:hAnsi="Segoe UI Emoji" w:cs="Segoe UI Emoji"/>
+        </w:rPr>
+        <w:t xml:space="preserve"> "For our next phase in Senior Project 2 (August to December), we will focus entirely on full-stack implementation. We will integrate the Google OAuth and </w:t>
+      </w:r>
+      <w:proofErr w:type="spellStart"/>
+      <w:r>
+        <w:rPr>
+          <w:rFonts w:ascii="Segoe UI Emoji" w:hAnsi="Segoe UI Emoji" w:cs="Segoe UI Emoji"/>
+        </w:rPr>
+        <w:t>Opn</w:t>
+      </w:r>
+      <w:proofErr w:type="spellEnd"/>
+      <w:r>
+        <w:rPr>
+          <w:rFonts w:ascii="Segoe UI Emoji" w:hAnsi="Segoe UI Emoji" w:cs="Segoe UI Emoji"/>
+        </w:rPr>
+        <w:t xml:space="preserve"> Payments APIs, followed by rigorous software testing to resolve bugs and guarantee system stability.</w:t>
       </w:r>
     </w:p>
     <w:p>
       <w:pPr>
-        <w:numPr>
-          <w:ilvl w:val="0"/>
-          <w:numId w:val="4"/>
-        </w:numPr>
-      </w:pPr>
-      <w:r>
-        <w:t>"We grouped our users into three types:</w:t>
+        <w:rPr>
+          <w:rFonts w:ascii="Segoe UI Emoji" w:hAnsi="Segoe UI Emoji" w:cs="Segoe UI Emoji"/>
+        </w:rPr>
+      </w:pPr>
+      <w:r>
+        <w:rPr>
+          <w:rFonts w:ascii="Segoe UI Emoji" w:hAnsi="Segoe UI Emoji" w:cs="Segoe UI Emoji"/>
+        </w:rPr>
+        <w:t>Ultimately, the successful deployment of this web-based system will completely modernize MFU's room reservation process. It will eradicate manual paperwork, optimize facility utilization, and significantly enhance the university's commercial revenue generation capabilities.</w:t>
       </w:r>
     </w:p>
     <w:p>
       <w:pPr>
-        <w:numPr>
-          <w:ilvl w:val="1"/>
-          <w:numId w:val="4"/>
-        </w:numPr>
-      </w:pPr>
-      <w:r>
-        <w:rPr>
-          <w:b/>
-          <w:bCs/>
-        </w:rPr>
-        <w:t>Internal Users</w:t>
-      </w:r>
-      <w:r>
-        <w:t>, like MFU students and staff</w:t>
-      </w:r>
-      <w:proofErr w:type="gramStart"/>
-      <w:r>
-        <w:t>, who</w:t>
-      </w:r>
-      <w:proofErr w:type="gramEnd"/>
-      <w:r>
-        <w:t xml:space="preserve"> get a special discount rate.</w:t>
+        <w:rPr>
+          <w:rFonts w:ascii="Segoe UI Emoji" w:hAnsi="Segoe UI Emoji" w:cs="Segoe UI Emoji"/>
+        </w:rPr>
+      </w:pPr>
+      <w:r>
+        <w:rPr>
+          <w:rFonts w:ascii="Segoe UI Emoji" w:hAnsi="Segoe UI Emoji" w:cs="Segoe UI Emoji"/>
+          <w:b/>
+          <w:bCs/>
+        </w:rPr>
+        <w:t>☑ Slide 18: Q&amp;A</w:t>
+      </w:r>
+      <w:r>
+        <w:rPr>
+          <w:rFonts w:ascii="Segoe UI Emoji" w:hAnsi="Segoe UI Emoji" w:cs="Segoe UI Emoji"/>
+        </w:rPr>
+        <w:t xml:space="preserve"> "Thank you very much for your time and attention. We would now like to open the floor to the committee for any questions, comments, or technical feedback. Thank you."</w:t>
       </w:r>
     </w:p>
     <w:p>
       <w:pPr>
-        <w:numPr>
-          <w:ilvl w:val="1"/>
-          <w:numId w:val="4"/>
-        </w:numPr>
-      </w:pPr>
-      <w:r>
-        <w:rPr>
-          <w:b/>
-          <w:bCs/>
-        </w:rPr>
-        <w:t>External Users</w:t>
-      </w:r>
-      <w:r>
-        <w:t>, like outside companies, who pay the normal rate.</w:t>
-      </w:r>
+        <w:rPr>
+          <w:cs/>
+        </w:rPr>
+      </w:pPr>
     </w:p>
-    <w:p>
-      <w:pPr>
-        <w:numPr>
-          <w:ilvl w:val="1"/>
-          <w:numId w:val="4"/>
-        </w:numPr>
-      </w:pPr>
-      <w:r>
-        <w:rPr>
-          <w:b/>
-          <w:bCs/>
-        </w:rPr>
-        <w:t>Collaborative Users</w:t>
-      </w:r>
-      <w:r>
-        <w:t>, like partners, who get a mid-range rate."</w:t>
-      </w:r>
-    </w:p>
-    <w:p>
-      <w:pPr>
-        <w:numPr>
-          <w:ilvl w:val="0"/>
-          <w:numId w:val="4"/>
-        </w:numPr>
-      </w:pPr>
-      <w:r>
-        <w:t xml:space="preserve">"Now, </w:t>
-      </w:r>
-      <w:proofErr w:type="spellStart"/>
-      <w:r>
-        <w:t>Phloiphailin</w:t>
-      </w:r>
-      <w:proofErr w:type="spellEnd"/>
-      <w:r>
-        <w:t xml:space="preserve"> will explain the </w:t>
-      </w:r>
-      <w:proofErr w:type="gramStart"/>
-      <w:r>
-        <w:t>Admin</w:t>
-      </w:r>
-      <w:proofErr w:type="gramEnd"/>
-      <w:r>
-        <w:t xml:space="preserve"> side."</w:t>
-      </w:r>
-    </w:p>
-    <w:p>
-      <w:r>
-        <w:rPr>
-          <w:b/>
-          <w:bCs/>
-        </w:rPr>
-        <w:lastRenderedPageBreak/>
-        <w:t>[Slide 8-9: Admin Controls &amp; Digital Workflow]</w:t>
-      </w:r>
-    </w:p>
-    <w:p>
-      <w:r>
-        <w:rPr>
-          <w:b/>
-          <w:bCs/>
-        </w:rPr>
-        <w:t xml:space="preserve">(Presenter 3: </w:t>
-      </w:r>
-      <w:proofErr w:type="spellStart"/>
-      <w:r>
-        <w:rPr>
-          <w:b/>
-          <w:bCs/>
-        </w:rPr>
-        <w:t>Phloiphailin</w:t>
-      </w:r>
-      <w:proofErr w:type="spellEnd"/>
-      <w:r>
-        <w:rPr>
-          <w:b/>
-          <w:bCs/>
-        </w:rPr>
-        <w:t>)</w:t>
-      </w:r>
-    </w:p>
-    <w:p>
-      <w:pPr>
-        <w:numPr>
-          <w:ilvl w:val="0"/>
-          <w:numId w:val="5"/>
-        </w:numPr>
-      </w:pPr>
-      <w:r>
-        <w:t xml:space="preserve">"Thank you! On the Admin side, staff can easily manage rooms and </w:t>
-      </w:r>
-      <w:proofErr w:type="gramStart"/>
-      <w:r>
-        <w:t>prices, and</w:t>
-      </w:r>
-      <w:proofErr w:type="gramEnd"/>
-      <w:r>
-        <w:t xml:space="preserve"> even upload lots of room data at once using Excel. We also built an Admin Dashboard with cool interactive graphs to track bookings and revenue."</w:t>
-      </w:r>
-    </w:p>
-    <w:p>
-      <w:pPr>
-        <w:numPr>
-          <w:ilvl w:val="0"/>
-          <w:numId w:val="5"/>
-        </w:numPr>
-      </w:pPr>
-      <w:r>
-        <w:t xml:space="preserve">"For the workflow, we are saying goodbye to waiting for paper signatures! Admins can approve bookings instantly, upload official permission files, and send approved documents right back to the user. Next, </w:t>
-      </w:r>
-      <w:proofErr w:type="spellStart"/>
-      <w:r>
-        <w:t>Phongsaphak</w:t>
-      </w:r>
-      <w:proofErr w:type="spellEnd"/>
-      <w:r>
-        <w:t xml:space="preserve"> will talk about our timeline and tech stack."</w:t>
-      </w:r>
-    </w:p>
-    <w:p>
-      <w:r>
-        <w:rPr>
-          <w:b/>
-          <w:bCs/>
-        </w:rPr>
-        <w:t>[Slide 10-1</w:t>
-      </w:r>
-      <w:r>
-        <w:rPr>
-          <w:b/>
-          <w:bCs/>
-        </w:rPr>
-        <w:t>2</w:t>
-      </w:r>
-      <w:r>
-        <w:rPr>
-          <w:b/>
-          <w:bCs/>
-        </w:rPr>
-        <w:t>: Timeline &amp; Technology]</w:t>
-      </w:r>
-    </w:p>
-    <w:p>
-      <w:r>
-        <w:rPr>
-          <w:b/>
-          <w:bCs/>
-        </w:rPr>
-        <w:t xml:space="preserve">(Presenter 4: </w:t>
-      </w:r>
-      <w:proofErr w:type="spellStart"/>
-      <w:r>
-        <w:rPr>
-          <w:b/>
-          <w:bCs/>
-        </w:rPr>
-        <w:t>Phongsaphak</w:t>
-      </w:r>
-      <w:proofErr w:type="spellEnd"/>
-      <w:r>
-        <w:rPr>
-          <w:b/>
-          <w:bCs/>
-        </w:rPr>
-        <w:t>)</w:t>
-      </w:r>
-    </w:p>
-    <w:p>
-      <w:pPr>
-        <w:numPr>
-          <w:ilvl w:val="0"/>
-          <w:numId w:val="6"/>
-        </w:numPr>
-      </w:pPr>
-      <w:r>
-        <w:t>"Thanks! We started in January with our proposal, designed the system in February, and now we're busy coding and testing. We're making sure it works perfectly by talking with the Asset Management Office and CITS."</w:t>
-      </w:r>
-    </w:p>
-    <w:p>
-      <w:pPr>
-        <w:numPr>
-          <w:ilvl w:val="0"/>
-          <w:numId w:val="6"/>
-        </w:numPr>
-      </w:pPr>
-      <w:r>
-        <w:t xml:space="preserve">"For our tech stack, we're using modern tools: </w:t>
-      </w:r>
-      <w:r>
-        <w:rPr>
-          <w:b/>
-          <w:bCs/>
-        </w:rPr>
-        <w:t>Vue.js and Tailwind CSS</w:t>
-      </w:r>
-      <w:r>
-        <w:t xml:space="preserve"> for a nice </w:t>
-      </w:r>
-      <w:proofErr w:type="gramStart"/>
-      <w:r>
-        <w:t>frontend ,</w:t>
-      </w:r>
-      <w:proofErr w:type="gramEnd"/>
-      <w:r>
-        <w:t xml:space="preserve"> </w:t>
-      </w:r>
-      <w:r>
-        <w:rPr>
-          <w:b/>
-          <w:bCs/>
-        </w:rPr>
-        <w:t>Node.js</w:t>
-      </w:r>
-      <w:r>
-        <w:t xml:space="preserve"> for the </w:t>
-      </w:r>
-      <w:proofErr w:type="gramStart"/>
-      <w:r>
-        <w:t>backend ,</w:t>
-      </w:r>
-      <w:proofErr w:type="gramEnd"/>
-      <w:r>
-        <w:t xml:space="preserve"> and </w:t>
-      </w:r>
-      <w:r>
-        <w:rPr>
-          <w:b/>
-          <w:bCs/>
-        </w:rPr>
-        <w:t>PostgreSQL</w:t>
-      </w:r>
-      <w:r>
-        <w:t xml:space="preserve"> for the database."</w:t>
-      </w:r>
-    </w:p>
-    <w:p>
-      <w:pPr>
-        <w:numPr>
-          <w:ilvl w:val="0"/>
-          <w:numId w:val="6"/>
-        </w:numPr>
-      </w:pPr>
-      <w:r>
-        <w:t>"In the end, we expect this system to make booking rooms super convenient for everyone. It will also make the admin's job much faster and more transparent."</w:t>
-      </w:r>
-    </w:p>
-    <w:p>
-      <w:r>
-        <w:rPr>
-          <w:b/>
-          <w:bCs/>
-        </w:rPr>
-        <w:t>[Slide 1</w:t>
-      </w:r>
-      <w:r>
-        <w:rPr>
-          <w:b/>
-          <w:bCs/>
-        </w:rPr>
-        <w:t>3</w:t>
-      </w:r>
-      <w:r>
-        <w:rPr>
-          <w:b/>
-          <w:bCs/>
-        </w:rPr>
-        <w:t>-14: Expected Results &amp; Conclusion]</w:t>
-      </w:r>
-    </w:p>
-    <w:p>
-      <w:r>
-        <w:rPr>
-          <w:b/>
-          <w:bCs/>
-        </w:rPr>
-        <w:t xml:space="preserve">(Presenter 4: </w:t>
-      </w:r>
-      <w:proofErr w:type="spellStart"/>
-      <w:r>
-        <w:rPr>
-          <w:b/>
-          <w:bCs/>
-        </w:rPr>
-        <w:t>P</w:t>
-      </w:r>
-      <w:r>
-        <w:rPr>
-          <w:b/>
-          <w:bCs/>
-        </w:rPr>
-        <w:t>aniti</w:t>
-      </w:r>
-      <w:proofErr w:type="spellEnd"/>
-      <w:r>
-        <w:rPr>
-          <w:b/>
-          <w:bCs/>
-        </w:rPr>
-        <w:t>)</w:t>
-      </w:r>
-    </w:p>
-    <w:p>
-      <w:pPr>
-        <w:numPr>
-          <w:ilvl w:val="0"/>
-          <w:numId w:val="7"/>
-        </w:numPr>
-      </w:pPr>
-      <w:r>
-        <w:t>"To sum up, our project turns a slow, paper-based process into a fast, online system that stops double-booking and saves a lot of time."</w:t>
-      </w:r>
-    </w:p>
-    <w:p>
-      <w:pPr>
-        <w:numPr>
-          <w:ilvl w:val="0"/>
-          <w:numId w:val="7"/>
-        </w:numPr>
-      </w:pPr>
-      <w:r>
-        <w:t>"Thank you so much for listening! We are now happy to answer any questions from the committee."</w:t>
-      </w:r>
-    </w:p>
-    <w:p/>
     <w:sectPr>
       <w:pgSz w:w="11906" w:h="16838"/>
       <w:pgMar w:top="1440" w:right="1440" w:bottom="1440" w:left="1440" w:header="708" w:footer="708" w:gutter="0"/>
@@ -700,6 +2101,119 @@
 <file path=word/numbering.xml><?xml version="1.0" encoding="utf-8"?>
 <w:numbering xmlns:wpc="http://schemas.microsoft.com/office/word/2010/wordprocessingCanvas" xmlns:cx="http://schemas.microsoft.com/office/drawing/2014/chartex" xmlns:cx1="http://schemas.microsoft.com/office/drawing/2015/9/8/chartex" xmlns:cx2="http://schemas.microsoft.com/office/drawing/2015/10/21/chartex" xmlns:cx3="http://schemas.microsoft.com/office/drawing/2016/5/9/chartex" xmlns:cx4="http://schemas.microsoft.com/office/drawing/2016/5/10/chartex" xmlns:cx5="http://schemas.microsoft.com/office/drawing/2016/5/11/chartex" xmlns:cx6="http://schemas.microsoft.com/office/drawing/2016/5/12/chartex" xmlns:cx7="http://schemas.microsoft.com/office/drawing/2016/5/13/chartex" xmlns:cx8="http://schemas.microsoft.com/office/drawing/2016/5/14/chartex" xmlns:mc="http://schemas.openxmlformats.org/markup-compatibility/2006" xmlns:aink="http://schemas.microsoft.com/office/drawing/2016/ink" xmlns:am3d="http://schemas.microsoft.com/office/drawing/2017/model3d" xmlns:o="urn:schemas-microsoft-com:office:office" xmlns:oel="http://schemas.microsoft.com/office/2019/extlst" xmlns:r="http://schemas.openxmlformats.org/officeDocument/2006/relationships" xmlns:m="http://schemas.openxmlformats.org/officeDocument/2006/math" xmlns:v="urn:schemas-microsoft-com:vml" xmlns:wp14="http://schemas.microsoft.com/office/word/2010/wordprocessingDrawing" xmlns:wp="http://schemas.openxmlformats.org/drawingml/2006/wordprocessingDrawing" xmlns:w10="urn:schemas-microsoft-com:office:word" xmlns:w="http://schemas.openxmlformats.org/wordprocessingml/2006/main" xmlns:w14="http://schemas.microsoft.com/office/word/2010/wordml" xmlns:w15="http://schemas.microsoft.com/office/word/2012/wordml" xmlns:w16cex="http://schemas.microsoft.com/office/word/2018/wordml/cex" xmlns:w16cid="http://schemas.microsoft.com/office/word/2016/wordml/cid" xmlns:w16="http://schemas.microsoft.com/office/word/2018/wordml" xmlns:w16du="http://schemas.microsoft.com/office/word/2023/wordml/word16du" xmlns:w16sdtdh="http://schemas.microsoft.com/office/word/2020/wordml/sdtdatahash" xmlns:w16sdtfl="http://schemas.microsoft.com/office/word/2024/wordml/sdtformatlock" xmlns:w16se="http://schemas.microsoft.com/office/word/2015/wordml/symex" xmlns:wpg="http://schemas.microsoft.com/office/word/2010/wordprocessingGroup" xmlns:wpi="http://schemas.microsoft.com/office/word/2010/wordprocessingInk" xmlns:wne="http://schemas.microsoft.com/office/word/2006/wordml" xmlns:wps="http://schemas.microsoft.com/office/word/2010/wordprocessingShape" mc:Ignorable="w14 w15 w16se w16cid w16 w16cex w16sdtdh w16sdtfl w16du wp14">
   <w:abstractNum w:abstractNumId="0" w15:restartNumberingAfterBreak="0">
+    <w:nsid w:val="03AB77A7"/>
+    <w:multiLevelType w:val="multilevel"/>
+    <w:tmpl w:val="28D4A440"/>
+    <w:lvl w:ilvl="0">
+      <w:start w:val="1"/>
+      <w:numFmt w:val="decimal"/>
+      <w:lvlText w:val="%1."/>
+      <w:lvlJc w:val="left"/>
+      <w:pPr>
+        <w:tabs>
+          <w:tab w:val="num" w:pos="720"/>
+        </w:tabs>
+        <w:ind w:left="720" w:hanging="360"/>
+      </w:pPr>
+    </w:lvl>
+    <w:lvl w:ilvl="1" w:tentative="1">
+      <w:start w:val="1"/>
+      <w:numFmt w:val="decimal"/>
+      <w:lvlText w:val="%2."/>
+      <w:lvlJc w:val="left"/>
+      <w:pPr>
+        <w:tabs>
+          <w:tab w:val="num" w:pos="1440"/>
+        </w:tabs>
+        <w:ind w:left="1440" w:hanging="360"/>
+      </w:pPr>
+    </w:lvl>
+    <w:lvl w:ilvl="2" w:tentative="1">
+      <w:start w:val="1"/>
+      <w:numFmt w:val="decimal"/>
+      <w:lvlText w:val="%3."/>
+      <w:lvlJc w:val="left"/>
+      <w:pPr>
+        <w:tabs>
+          <w:tab w:val="num" w:pos="2160"/>
+        </w:tabs>
+        <w:ind w:left="2160" w:hanging="360"/>
+      </w:pPr>
+    </w:lvl>
+    <w:lvl w:ilvl="3" w:tentative="1">
+      <w:start w:val="1"/>
+      <w:numFmt w:val="decimal"/>
+      <w:lvlText w:val="%4."/>
+      <w:lvlJc w:val="left"/>
+      <w:pPr>
+        <w:tabs>
+          <w:tab w:val="num" w:pos="2880"/>
+        </w:tabs>
+        <w:ind w:left="2880" w:hanging="360"/>
+      </w:pPr>
+    </w:lvl>
+    <w:lvl w:ilvl="4" w:tentative="1">
+      <w:start w:val="1"/>
+      <w:numFmt w:val="decimal"/>
+      <w:lvlText w:val="%5."/>
+      <w:lvlJc w:val="left"/>
+      <w:pPr>
+        <w:tabs>
+          <w:tab w:val="num" w:pos="3600"/>
+        </w:tabs>
+        <w:ind w:left="3600" w:hanging="360"/>
+      </w:pPr>
+    </w:lvl>
+    <w:lvl w:ilvl="5" w:tentative="1">
+      <w:start w:val="1"/>
+      <w:numFmt w:val="decimal"/>
+      <w:lvlText w:val="%6."/>
+      <w:lvlJc w:val="left"/>
+      <w:pPr>
+        <w:tabs>
+          <w:tab w:val="num" w:pos="4320"/>
+        </w:tabs>
+        <w:ind w:left="4320" w:hanging="360"/>
+      </w:pPr>
+    </w:lvl>
+    <w:lvl w:ilvl="6" w:tentative="1">
+      <w:start w:val="1"/>
+      <w:numFmt w:val="decimal"/>
+      <w:lvlText w:val="%7."/>
+      <w:lvlJc w:val="left"/>
+      <w:pPr>
+        <w:tabs>
+          <w:tab w:val="num" w:pos="5040"/>
+        </w:tabs>
+        <w:ind w:left="5040" w:hanging="360"/>
+      </w:pPr>
+    </w:lvl>
+    <w:lvl w:ilvl="7" w:tentative="1">
+      <w:start w:val="1"/>
+      <w:numFmt w:val="decimal"/>
+      <w:lvlText w:val="%8."/>
+      <w:lvlJc w:val="left"/>
+      <w:pPr>
+        <w:tabs>
+          <w:tab w:val="num" w:pos="5760"/>
+        </w:tabs>
+        <w:ind w:left="5760" w:hanging="360"/>
+      </w:pPr>
+    </w:lvl>
+    <w:lvl w:ilvl="8" w:tentative="1">
+      <w:start w:val="1"/>
+      <w:numFmt w:val="decimal"/>
+      <w:lvlText w:val="%9."/>
+      <w:lvlJc w:val="left"/>
+      <w:pPr>
+        <w:tabs>
+          <w:tab w:val="num" w:pos="6480"/>
+        </w:tabs>
+        <w:ind w:left="6480" w:hanging="360"/>
+      </w:pPr>
+    </w:lvl>
+  </w:abstractNum>
+  <w:abstractNum w:abstractNumId="1" w15:restartNumberingAfterBreak="0">
     <w:nsid w:val="1DDB03B3"/>
     <w:multiLevelType w:val="multilevel"/>
     <w:tmpl w:val="20A841C6"/>
@@ -848,7 +2362,7 @@
       </w:rPr>
     </w:lvl>
   </w:abstractNum>
-  <w:abstractNum w:abstractNumId="1" w15:restartNumberingAfterBreak="0">
+  <w:abstractNum w:abstractNumId="2" w15:restartNumberingAfterBreak="0">
     <w:nsid w:val="2A8B41F7"/>
     <w:multiLevelType w:val="multilevel"/>
     <w:tmpl w:val="DB68B1D4"/>
@@ -997,7 +2511,7 @@
       </w:rPr>
     </w:lvl>
   </w:abstractNum>
-  <w:abstractNum w:abstractNumId="2" w15:restartNumberingAfterBreak="0">
+  <w:abstractNum w:abstractNumId="3" w15:restartNumberingAfterBreak="0">
     <w:nsid w:val="4A2A7420"/>
     <w:multiLevelType w:val="multilevel"/>
     <w:tmpl w:val="6B644FCA"/>
@@ -1146,7 +2660,120 @@
       </w:rPr>
     </w:lvl>
   </w:abstractNum>
-  <w:abstractNum w:abstractNumId="3" w15:restartNumberingAfterBreak="0">
+  <w:abstractNum w:abstractNumId="4" w15:restartNumberingAfterBreak="0">
+    <w:nsid w:val="514F7B55"/>
+    <w:multiLevelType w:val="multilevel"/>
+    <w:tmpl w:val="9544D160"/>
+    <w:lvl w:ilvl="0">
+      <w:start w:val="1"/>
+      <w:numFmt w:val="decimal"/>
+      <w:lvlText w:val="%1."/>
+      <w:lvlJc w:val="left"/>
+      <w:pPr>
+        <w:tabs>
+          <w:tab w:val="num" w:pos="720"/>
+        </w:tabs>
+        <w:ind w:left="720" w:hanging="360"/>
+      </w:pPr>
+    </w:lvl>
+    <w:lvl w:ilvl="1" w:tentative="1">
+      <w:start w:val="1"/>
+      <w:numFmt w:val="decimal"/>
+      <w:lvlText w:val="%2."/>
+      <w:lvlJc w:val="left"/>
+      <w:pPr>
+        <w:tabs>
+          <w:tab w:val="num" w:pos="1440"/>
+        </w:tabs>
+        <w:ind w:left="1440" w:hanging="360"/>
+      </w:pPr>
+    </w:lvl>
+    <w:lvl w:ilvl="2" w:tentative="1">
+      <w:start w:val="1"/>
+      <w:numFmt w:val="decimal"/>
+      <w:lvlText w:val="%3."/>
+      <w:lvlJc w:val="left"/>
+      <w:pPr>
+        <w:tabs>
+          <w:tab w:val="num" w:pos="2160"/>
+        </w:tabs>
+        <w:ind w:left="2160" w:hanging="360"/>
+      </w:pPr>
+    </w:lvl>
+    <w:lvl w:ilvl="3" w:tentative="1">
+      <w:start w:val="1"/>
+      <w:numFmt w:val="decimal"/>
+      <w:lvlText w:val="%4."/>
+      <w:lvlJc w:val="left"/>
+      <w:pPr>
+        <w:tabs>
+          <w:tab w:val="num" w:pos="2880"/>
+        </w:tabs>
+        <w:ind w:left="2880" w:hanging="360"/>
+      </w:pPr>
+    </w:lvl>
+    <w:lvl w:ilvl="4" w:tentative="1">
+      <w:start w:val="1"/>
+      <w:numFmt w:val="decimal"/>
+      <w:lvlText w:val="%5."/>
+      <w:lvlJc w:val="left"/>
+      <w:pPr>
+        <w:tabs>
+          <w:tab w:val="num" w:pos="3600"/>
+        </w:tabs>
+        <w:ind w:left="3600" w:hanging="360"/>
+      </w:pPr>
+    </w:lvl>
+    <w:lvl w:ilvl="5" w:tentative="1">
+      <w:start w:val="1"/>
+      <w:numFmt w:val="decimal"/>
+      <w:lvlText w:val="%6."/>
+      <w:lvlJc w:val="left"/>
+      <w:pPr>
+        <w:tabs>
+          <w:tab w:val="num" w:pos="4320"/>
+        </w:tabs>
+        <w:ind w:left="4320" w:hanging="360"/>
+      </w:pPr>
+    </w:lvl>
+    <w:lvl w:ilvl="6" w:tentative="1">
+      <w:start w:val="1"/>
+      <w:numFmt w:val="decimal"/>
+      <w:lvlText w:val="%7."/>
+      <w:lvlJc w:val="left"/>
+      <w:pPr>
+        <w:tabs>
+          <w:tab w:val="num" w:pos="5040"/>
+        </w:tabs>
+        <w:ind w:left="5040" w:hanging="360"/>
+      </w:pPr>
+    </w:lvl>
+    <w:lvl w:ilvl="7" w:tentative="1">
+      <w:start w:val="1"/>
+      <w:numFmt w:val="decimal"/>
+      <w:lvlText w:val="%8."/>
+      <w:lvlJc w:val="left"/>
+      <w:pPr>
+        <w:tabs>
+          <w:tab w:val="num" w:pos="5760"/>
+        </w:tabs>
+        <w:ind w:left="5760" w:hanging="360"/>
+      </w:pPr>
+    </w:lvl>
+    <w:lvl w:ilvl="8" w:tentative="1">
+      <w:start w:val="1"/>
+      <w:numFmt w:val="decimal"/>
+      <w:lvlText w:val="%9."/>
+      <w:lvlJc w:val="left"/>
+      <w:pPr>
+        <w:tabs>
+          <w:tab w:val="num" w:pos="6480"/>
+        </w:tabs>
+        <w:ind w:left="6480" w:hanging="360"/>
+      </w:pPr>
+    </w:lvl>
+  </w:abstractNum>
+  <w:abstractNum w:abstractNumId="5" w15:restartNumberingAfterBreak="0">
     <w:nsid w:val="6D5C2B5E"/>
     <w:multiLevelType w:val="multilevel"/>
     <w:tmpl w:val="C05AB9C8"/>
@@ -1295,7 +2922,7 @@
       </w:rPr>
     </w:lvl>
   </w:abstractNum>
-  <w:abstractNum w:abstractNumId="4" w15:restartNumberingAfterBreak="0">
+  <w:abstractNum w:abstractNumId="6" w15:restartNumberingAfterBreak="0">
     <w:nsid w:val="6F305B12"/>
     <w:multiLevelType w:val="multilevel"/>
     <w:tmpl w:val="265AAB0A"/>
@@ -1444,7 +3071,7 @@
       </w:rPr>
     </w:lvl>
   </w:abstractNum>
-  <w:abstractNum w:abstractNumId="5" w15:restartNumberingAfterBreak="0">
+  <w:abstractNum w:abstractNumId="7" w15:restartNumberingAfterBreak="0">
     <w:nsid w:val="74CB507D"/>
     <w:multiLevelType w:val="multilevel"/>
     <w:tmpl w:val="47C0248A"/>
@@ -1593,7 +3220,7 @@
       </w:rPr>
     </w:lvl>
   </w:abstractNum>
-  <w:abstractNum w:abstractNumId="6" w15:restartNumberingAfterBreak="0">
+  <w:abstractNum w:abstractNumId="8" w15:restartNumberingAfterBreak="0">
     <w:nsid w:val="7522730B"/>
     <w:multiLevelType w:val="multilevel"/>
     <w:tmpl w:val="5DF01700"/>
@@ -1742,26 +3369,184 @@
       </w:rPr>
     </w:lvl>
   </w:abstractNum>
+  <w:abstractNum w:abstractNumId="9" w15:restartNumberingAfterBreak="0">
+    <w:nsid w:val="799523E7"/>
+    <w:multiLevelType w:val="multilevel"/>
+    <w:tmpl w:val="264C8400"/>
+    <w:lvl w:ilvl="0">
+      <w:start w:val="1"/>
+      <w:numFmt w:val="bullet"/>
+      <w:lvlText w:val=""/>
+      <w:lvlJc w:val="left"/>
+      <w:pPr>
+        <w:tabs>
+          <w:tab w:val="num" w:pos="720"/>
+        </w:tabs>
+        <w:ind w:left="720" w:hanging="360"/>
+      </w:pPr>
+      <w:rPr>
+        <w:rFonts w:ascii="Symbol" w:hAnsi="Symbol" w:hint="default"/>
+        <w:sz w:val="20"/>
+      </w:rPr>
+    </w:lvl>
+    <w:lvl w:ilvl="1" w:tentative="1">
+      <w:start w:val="1"/>
+      <w:numFmt w:val="bullet"/>
+      <w:lvlText w:val="o"/>
+      <w:lvlJc w:val="left"/>
+      <w:pPr>
+        <w:tabs>
+          <w:tab w:val="num" w:pos="1440"/>
+        </w:tabs>
+        <w:ind w:left="1440" w:hanging="360"/>
+      </w:pPr>
+      <w:rPr>
+        <w:rFonts w:ascii="Courier New" w:hAnsi="Courier New" w:hint="default"/>
+        <w:sz w:val="20"/>
+      </w:rPr>
+    </w:lvl>
+    <w:lvl w:ilvl="2" w:tentative="1">
+      <w:start w:val="1"/>
+      <w:numFmt w:val="bullet"/>
+      <w:lvlText w:val=""/>
+      <w:lvlJc w:val="left"/>
+      <w:pPr>
+        <w:tabs>
+          <w:tab w:val="num" w:pos="2160"/>
+        </w:tabs>
+        <w:ind w:left="2160" w:hanging="360"/>
+      </w:pPr>
+      <w:rPr>
+        <w:rFonts w:ascii="Wingdings" w:hAnsi="Wingdings" w:hint="default"/>
+        <w:sz w:val="20"/>
+      </w:rPr>
+    </w:lvl>
+    <w:lvl w:ilvl="3" w:tentative="1">
+      <w:start w:val="1"/>
+      <w:numFmt w:val="bullet"/>
+      <w:lvlText w:val=""/>
+      <w:lvlJc w:val="left"/>
+      <w:pPr>
+        <w:tabs>
+          <w:tab w:val="num" w:pos="2880"/>
+        </w:tabs>
+        <w:ind w:left="2880" w:hanging="360"/>
+      </w:pPr>
+      <w:rPr>
+        <w:rFonts w:ascii="Wingdings" w:hAnsi="Wingdings" w:hint="default"/>
+        <w:sz w:val="20"/>
+      </w:rPr>
+    </w:lvl>
+    <w:lvl w:ilvl="4" w:tentative="1">
+      <w:start w:val="1"/>
+      <w:numFmt w:val="bullet"/>
+      <w:lvlText w:val=""/>
+      <w:lvlJc w:val="left"/>
+      <w:pPr>
+        <w:tabs>
+          <w:tab w:val="num" w:pos="3600"/>
+        </w:tabs>
+        <w:ind w:left="3600" w:hanging="360"/>
+      </w:pPr>
+      <w:rPr>
+        <w:rFonts w:ascii="Wingdings" w:hAnsi="Wingdings" w:hint="default"/>
+        <w:sz w:val="20"/>
+      </w:rPr>
+    </w:lvl>
+    <w:lvl w:ilvl="5" w:tentative="1">
+      <w:start w:val="1"/>
+      <w:numFmt w:val="bullet"/>
+      <w:lvlText w:val=""/>
+      <w:lvlJc w:val="left"/>
+      <w:pPr>
+        <w:tabs>
+          <w:tab w:val="num" w:pos="4320"/>
+        </w:tabs>
+        <w:ind w:left="4320" w:hanging="360"/>
+      </w:pPr>
+      <w:rPr>
+        <w:rFonts w:ascii="Wingdings" w:hAnsi="Wingdings" w:hint="default"/>
+        <w:sz w:val="20"/>
+      </w:rPr>
+    </w:lvl>
+    <w:lvl w:ilvl="6" w:tentative="1">
+      <w:start w:val="1"/>
+      <w:numFmt w:val="bullet"/>
+      <w:lvlText w:val=""/>
+      <w:lvlJc w:val="left"/>
+      <w:pPr>
+        <w:tabs>
+          <w:tab w:val="num" w:pos="5040"/>
+        </w:tabs>
+        <w:ind w:left="5040" w:hanging="360"/>
+      </w:pPr>
+      <w:rPr>
+        <w:rFonts w:ascii="Wingdings" w:hAnsi="Wingdings" w:hint="default"/>
+        <w:sz w:val="20"/>
+      </w:rPr>
+    </w:lvl>
+    <w:lvl w:ilvl="7" w:tentative="1">
+      <w:start w:val="1"/>
+      <w:numFmt w:val="bullet"/>
+      <w:lvlText w:val=""/>
+      <w:lvlJc w:val="left"/>
+      <w:pPr>
+        <w:tabs>
+          <w:tab w:val="num" w:pos="5760"/>
+        </w:tabs>
+        <w:ind w:left="5760" w:hanging="360"/>
+      </w:pPr>
+      <w:rPr>
+        <w:rFonts w:ascii="Wingdings" w:hAnsi="Wingdings" w:hint="default"/>
+        <w:sz w:val="20"/>
+      </w:rPr>
+    </w:lvl>
+    <w:lvl w:ilvl="8" w:tentative="1">
+      <w:start w:val="1"/>
+      <w:numFmt w:val="bullet"/>
+      <w:lvlText w:val=""/>
+      <w:lvlJc w:val="left"/>
+      <w:pPr>
+        <w:tabs>
+          <w:tab w:val="num" w:pos="6480"/>
+        </w:tabs>
+        <w:ind w:left="6480" w:hanging="360"/>
+      </w:pPr>
+      <w:rPr>
+        <w:rFonts w:ascii="Wingdings" w:hAnsi="Wingdings" w:hint="default"/>
+        <w:sz w:val="20"/>
+      </w:rPr>
+    </w:lvl>
+  </w:abstractNum>
   <w:num w:numId="1" w16cid:durableId="347560434">
+    <w:abstractNumId w:val="6"/>
+  </w:num>
+  <w:num w:numId="2" w16cid:durableId="1577545798">
+    <w:abstractNumId w:val="8"/>
+  </w:num>
+  <w:num w:numId="3" w16cid:durableId="196741364">
+    <w:abstractNumId w:val="7"/>
+  </w:num>
+  <w:num w:numId="4" w16cid:durableId="1690445549">
+    <w:abstractNumId w:val="2"/>
+  </w:num>
+  <w:num w:numId="5" w16cid:durableId="1604339868">
+    <w:abstractNumId w:val="1"/>
+  </w:num>
+  <w:num w:numId="6" w16cid:durableId="759256876">
+    <w:abstractNumId w:val="3"/>
+  </w:num>
+  <w:num w:numId="7" w16cid:durableId="1445004076">
+    <w:abstractNumId w:val="5"/>
+  </w:num>
+  <w:num w:numId="8" w16cid:durableId="1852715482">
     <w:abstractNumId w:val="4"/>
   </w:num>
-  <w:num w:numId="2" w16cid:durableId="1577545798">
-    <w:abstractNumId w:val="6"/>
-  </w:num>
-  <w:num w:numId="3" w16cid:durableId="196741364">
-    <w:abstractNumId w:val="5"/>
-  </w:num>
-  <w:num w:numId="4" w16cid:durableId="1690445549">
-    <w:abstractNumId w:val="1"/>
-  </w:num>
-  <w:num w:numId="5" w16cid:durableId="1604339868">
+  <w:num w:numId="9" w16cid:durableId="1782721101">
     <w:abstractNumId w:val="0"/>
   </w:num>
-  <w:num w:numId="6" w16cid:durableId="759256876">
-    <w:abstractNumId w:val="2"/>
-  </w:num>
-  <w:num w:numId="7" w16cid:durableId="1445004076">
-    <w:abstractNumId w:val="3"/>
+  <w:num w:numId="10" w16cid:durableId="779572945">
+    <w:abstractNumId w:val="9"/>
   </w:num>
 </w:numbering>
 </file>

</xml_diff>